<commit_message>
Completely finish Lab01 - Task Pass
</commit_message>
<xml_diff>
--- a/Laboratory/Task01/TO1P-1.docx
+++ b/Laboratory/Task01/TO1P-1.docx
@@ -544,7 +544,7 @@
                 <w:vertAlign w:val="baseline"/>
                 <w:lang w:val="en-US"/>
               </w:rPr>
-              <w:t>Build a reusable, custome dataset or perform actions to data</w:t>
+              <w:t>Build a reusable, custom dataset or perform actions to data</w:t>
             </w:r>
           </w:p>
         </w:tc>
@@ -741,7 +741,7 @@
                 <w:vertAlign w:val="baseline"/>
                 <w:lang w:val="en-US"/>
               </w:rPr>
-              <w:t>Temporarily, freuquently disappears when the form or table is closed.</w:t>
+              <w:t>Temporary, frequently disappears when the form or table is closed.</w:t>
             </w:r>
           </w:p>
         </w:tc>
@@ -910,6 +910,17 @@
             </w:r>
             <w:r>
               <w:rPr>
+                <w:rFonts w:hint="default" w:ascii="Times New Roman" w:hAnsi="Times New Roman" w:eastAsia="SimSun" w:cs="Times New Roman"/>
+                <w:b w:val="0"/>
+                <w:bCs w:val="0"/>
+                <w:sz w:val="25"/>
+                <w:szCs w:val="25"/>
+                <w:lang w:val="en-US"/>
+              </w:rPr>
+              <w:t>currently</w:t>
+            </w:r>
+            <w:r>
+              <w:rPr>
                 <w:rStyle w:val="8"/>
                 <w:rFonts w:hint="default" w:ascii="Times New Roman" w:hAnsi="Times New Roman" w:eastAsia="Arial" w:cs="Times New Roman"/>
                 <w:b w:val="0"/>
@@ -918,7 +929,7 @@
                 <w:szCs w:val="25"/>
                 <w:u w:val="none"/>
               </w:rPr>
-              <w:t>single active table, form, or report</w:t>
+              <w:t xml:space="preserve"> active table, form, or report</w:t>
             </w:r>
             <w:r>
               <w:rPr>
@@ -1454,7 +1465,26 @@
           <w:szCs w:val="25"/>
           <w:u w:val="none"/>
         </w:rPr>
-        <w:t xml:space="preserve">Due to the permanent object characteristics of the Query, </w:t>
+        <w:t xml:space="preserve">Due to the permanent </w:t>
+      </w:r>
+      <w:r>
+        <w:rPr>
+          <w:rFonts w:hint="default" w:ascii="Times New Roman" w:hAnsi="Times New Roman" w:eastAsia="Arial" w:cs="Times New Roman"/>
+          <w:sz w:val="25"/>
+          <w:szCs w:val="25"/>
+          <w:u w:val="none"/>
+          <w:lang w:val="en-US"/>
+        </w:rPr>
+        <w:t>nature</w:t>
+      </w:r>
+      <w:r>
+        <w:rPr>
+          <w:rFonts w:hint="default" w:ascii="Times New Roman" w:hAnsi="Times New Roman" w:eastAsia="Arial" w:cs="Times New Roman"/>
+          <w:sz w:val="25"/>
+          <w:szCs w:val="25"/>
+          <w:u w:val="none"/>
+        </w:rPr>
+        <w:t xml:space="preserve">, </w:t>
       </w:r>
       <w:r>
         <w:rPr>
@@ -1540,7 +1570,7 @@
           <w:u w:val="none"/>
           <w:lang w:val="en-US"/>
         </w:rPr>
-        <w:t>Secondly, Query has multi-table connect and support function that helps to combine and link data from multiple related tables into the only single view.</w:t>
+        <w:t>Secondly, Query supports multi-table connect and support function that helps to combine and link data from multiple related tables into the only single view.</w:t>
       </w:r>
     </w:p>
     <w:p>
@@ -2362,18 +2392,18 @@
       </w:pPr>
       <w:r>
         <w:drawing>
-          <wp:anchor distT="0" distB="0" distL="114300" distR="114300" simplePos="0" relativeHeight="251661312" behindDoc="0" locked="0" layoutInCell="1" allowOverlap="1">
+          <wp:anchor distT="0" distB="0" distL="114300" distR="114300" simplePos="0" relativeHeight="251681792" behindDoc="0" locked="0" layoutInCell="1" allowOverlap="1">
             <wp:simplePos x="0" y="0"/>
             <wp:positionH relativeFrom="column">
-              <wp:posOffset>2540</wp:posOffset>
+              <wp:posOffset>735965</wp:posOffset>
             </wp:positionH>
             <wp:positionV relativeFrom="paragraph">
-              <wp:posOffset>60960</wp:posOffset>
+              <wp:posOffset>97790</wp:posOffset>
             </wp:positionV>
-            <wp:extent cx="5269230" cy="2998470"/>
-            <wp:effectExtent l="0" t="0" r="3810" b="3810"/>
+            <wp:extent cx="3802380" cy="1043940"/>
+            <wp:effectExtent l="0" t="0" r="7620" b="7620"/>
             <wp:wrapSquare wrapText="bothSides"/>
-            <wp:docPr id="3" name="Picture 4"/>
+            <wp:docPr id="24" name="Picture 1"/>
             <wp:cNvGraphicFramePr>
               <a:graphicFrameLocks xmlns:a="http://schemas.openxmlformats.org/drawingml/2006/main" noChangeAspect="1"/>
             </wp:cNvGraphicFramePr>
@@ -2381,7 +2411,7 @@
               <a:graphicData uri="http://schemas.openxmlformats.org/drawingml/2006/picture">
                 <pic:pic xmlns:pic="http://schemas.openxmlformats.org/drawingml/2006/picture">
                   <pic:nvPicPr>
-                    <pic:cNvPr id="3" name="Picture 4"/>
+                    <pic:cNvPr id="24" name="Picture 1"/>
                     <pic:cNvPicPr>
                       <a:picLocks noChangeAspect="1"/>
                     </pic:cNvPicPr>
@@ -2395,7 +2425,7 @@
                   <pic:spPr>
                     <a:xfrm>
                       <a:off x="0" y="0"/>
-                      <a:ext cx="5269230" cy="2998470"/>
+                      <a:ext cx="3802380" cy="1043940"/>
                     </a:xfrm>
                     <a:prstGeom prst="rect">
                       <a:avLst/>
@@ -2423,43 +2453,14 @@
         </w:pBdr>
         <w:spacing w:before="0" w:beforeAutospacing="0" w:after="144" w:afterAutospacing="0" w:line="240" w:lineRule="auto"/>
         <w:ind w:left="0" w:right="0"/>
-        <w:jc w:val="center"/>
-        <w:rPr>
-          <w:rFonts w:hint="default" w:ascii="Times New Roman" w:hAnsi="Times New Roman" w:eastAsia="SimSun" w:cs="Times New Roman"/>
-          <w:b/>
-          <w:bCs/>
-          <w:i/>
-          <w:iCs/>
-          <w:sz w:val="21"/>
-          <w:szCs w:val="21"/>
-        </w:rPr>
-      </w:pPr>
-      <w:r>
-        <w:rPr>
-          <w:rFonts w:hint="default" w:ascii="Times New Roman" w:hAnsi="Times New Roman" w:eastAsia="Arial" w:cs="Times New Roman"/>
-          <w:b/>
-          <w:bCs/>
-          <w:i/>
-          <w:iCs/>
-          <w:sz w:val="21"/>
-          <w:szCs w:val="21"/>
-          <w:u w:val="none"/>
-          <w:lang w:val="en-US"/>
-        </w:rPr>
-        <w:t xml:space="preserve">Figure 3: </w:t>
-      </w:r>
-      <w:r>
-        <w:rPr>
-          <w:rFonts w:hint="default" w:ascii="Times New Roman" w:hAnsi="Times New Roman" w:eastAsia="SimSun" w:cs="Times New Roman"/>
-          <w:b/>
-          <w:bCs/>
-          <w:i/>
-          <w:iCs/>
-          <w:sz w:val="21"/>
-          <w:szCs w:val="21"/>
-        </w:rPr>
-        <w:t>Query Design showing all actors with Gender = "M"</w:t>
-      </w:r>
+        <w:jc w:val="both"/>
+        <w:rPr>
+          <w:rFonts w:hint="default" w:ascii="Times New Roman" w:hAnsi="Times New Roman" w:eastAsia="SimSun" w:cs="Times New Roman"/>
+          <w:sz w:val="25"/>
+          <w:szCs w:val="25"/>
+          <w:lang w:val="en-US"/>
+        </w:rPr>
+      </w:pPr>
     </w:p>
     <w:p>
       <w:pPr>
@@ -2468,7 +2469,67 @@
         <w:widowControl/>
         <w:suppressLineNumbers w:val="0"/>
         <w:pBdr>
-          <w:bottom w:val="single" w:color="auto" w:sz="4" w:space="0"/>
+          <w:bottom w:val="none" w:color="0A0A0A" w:sz="0" w:space="0"/>
+        </w:pBdr>
+        <w:spacing w:before="0" w:beforeAutospacing="0" w:after="144" w:afterAutospacing="0" w:line="240" w:lineRule="auto"/>
+        <w:ind w:left="0" w:right="0"/>
+        <w:jc w:val="both"/>
+        <w:rPr>
+          <w:rFonts w:hint="default" w:ascii="Times New Roman" w:hAnsi="Times New Roman" w:eastAsia="SimSun" w:cs="Times New Roman"/>
+          <w:sz w:val="25"/>
+          <w:szCs w:val="25"/>
+          <w:lang w:val="en-US"/>
+        </w:rPr>
+      </w:pPr>
+    </w:p>
+    <w:p>
+      <w:pPr>
+        <w:keepNext w:val="0"/>
+        <w:keepLines w:val="0"/>
+        <w:widowControl/>
+        <w:suppressLineNumbers w:val="0"/>
+        <w:pBdr>
+          <w:bottom w:val="none" w:color="0A0A0A" w:sz="0" w:space="0"/>
+        </w:pBdr>
+        <w:spacing w:before="0" w:beforeAutospacing="0" w:after="144" w:afterAutospacing="0" w:line="240" w:lineRule="auto"/>
+        <w:ind w:left="0" w:right="0"/>
+        <w:jc w:val="both"/>
+        <w:rPr>
+          <w:rFonts w:hint="default" w:ascii="Times New Roman" w:hAnsi="Times New Roman" w:eastAsia="SimSun" w:cs="Times New Roman"/>
+          <w:sz w:val="25"/>
+          <w:szCs w:val="25"/>
+          <w:lang w:val="en-US"/>
+        </w:rPr>
+      </w:pPr>
+    </w:p>
+    <w:p>
+      <w:pPr>
+        <w:keepNext w:val="0"/>
+        <w:keepLines w:val="0"/>
+        <w:widowControl/>
+        <w:suppressLineNumbers w:val="0"/>
+        <w:pBdr>
+          <w:bottom w:val="none" w:color="0A0A0A" w:sz="0" w:space="0"/>
+        </w:pBdr>
+        <w:spacing w:before="0" w:beforeAutospacing="0" w:after="144" w:afterAutospacing="0" w:line="240" w:lineRule="auto"/>
+        <w:ind w:left="0" w:right="0"/>
+        <w:jc w:val="both"/>
+        <w:rPr>
+          <w:rFonts w:hint="default" w:ascii="Times New Roman" w:hAnsi="Times New Roman" w:eastAsia="SimSun" w:cs="Times New Roman"/>
+          <w:sz w:val="25"/>
+          <w:szCs w:val="25"/>
+          <w:lang w:val="en-US"/>
+        </w:rPr>
+      </w:pPr>
+    </w:p>
+    <w:p>
+      <w:pPr>
+        <w:keepNext w:val="0"/>
+        <w:keepLines w:val="0"/>
+        <w:widowControl/>
+        <w:suppressLineNumbers w:val="0"/>
+        <w:pBdr>
+          <w:bottom w:val="none" w:color="0A0A0A" w:sz="0" w:space="0"/>
         </w:pBdr>
         <w:spacing w:before="0" w:beforeAutospacing="0" w:after="144" w:afterAutospacing="0" w:line="240" w:lineRule="auto"/>
         <w:ind w:left="0" w:right="0"/>
@@ -2485,35 +2546,75 @@
       </w:pPr>
       <w:r>
         <w:rPr>
-          <w:rFonts w:hint="default" w:ascii="Times New Roman" w:hAnsi="Times New Roman" w:cs="Times New Roman"/>
-          <w:b/>
-          <w:bCs/>
-          <w:i/>
-          <w:iCs/>
-          <w:sz w:val="21"/>
-          <w:szCs w:val="21"/>
-        </w:rPr>
+          <w:rFonts w:hint="default" w:ascii="Times New Roman" w:hAnsi="Times New Roman" w:eastAsia="Arial" w:cs="Times New Roman"/>
+          <w:b/>
+          <w:bCs/>
+          <w:i/>
+          <w:iCs/>
+          <w:sz w:val="21"/>
+          <w:szCs w:val="21"/>
+          <w:u w:val="none"/>
+          <w:lang w:val="en-US"/>
+        </w:rPr>
+        <w:t xml:space="preserve">Figure 3: </w:t>
+      </w:r>
+      <w:r>
+        <w:rPr>
+          <w:rFonts w:hint="default" w:ascii="Times New Roman" w:hAnsi="Times New Roman" w:eastAsia="SimSun" w:cs="Times New Roman"/>
+          <w:b/>
+          <w:bCs/>
+          <w:i/>
+          <w:iCs/>
+          <w:sz w:val="21"/>
+          <w:szCs w:val="21"/>
+        </w:rPr>
+        <w:t>Query Design showing all actors with Gender = "M"</w:t>
+      </w:r>
+    </w:p>
+    <w:p>
+      <w:pPr>
+        <w:keepNext w:val="0"/>
+        <w:keepLines w:val="0"/>
+        <w:widowControl/>
+        <w:suppressLineNumbers w:val="0"/>
+        <w:pBdr>
+          <w:bottom w:val="none" w:color="0A0A0A" w:sz="0" w:space="0"/>
+        </w:pBdr>
+        <w:spacing w:before="0" w:beforeAutospacing="0" w:after="144" w:afterAutospacing="0" w:line="240" w:lineRule="auto"/>
+        <w:ind w:left="0" w:right="0"/>
+        <w:jc w:val="center"/>
+        <w:rPr>
+          <w:rFonts w:hint="default" w:ascii="Times New Roman" w:hAnsi="Times New Roman" w:eastAsia="SimSun" w:cs="Times New Roman"/>
+          <w:b/>
+          <w:bCs/>
+          <w:i/>
+          <w:iCs/>
+          <w:sz w:val="21"/>
+          <w:szCs w:val="21"/>
+        </w:rPr>
+      </w:pPr>
+      <w:r>
         <w:drawing>
-          <wp:anchor distT="0" distB="0" distL="114300" distR="114300" simplePos="0" relativeHeight="251662336" behindDoc="1" locked="0" layoutInCell="1" allowOverlap="1">
+          <wp:anchor distT="0" distB="0" distL="114300" distR="114300" simplePos="0" relativeHeight="251682816" behindDoc="1" locked="0" layoutInCell="1" allowOverlap="1">
             <wp:simplePos x="0" y="0"/>
             <wp:positionH relativeFrom="column">
-              <wp:posOffset>0</wp:posOffset>
+              <wp:posOffset>846455</wp:posOffset>
             </wp:positionH>
             <wp:positionV relativeFrom="paragraph">
-              <wp:posOffset>0</wp:posOffset>
+              <wp:posOffset>132715</wp:posOffset>
             </wp:positionV>
-            <wp:extent cx="5274310" cy="2916555"/>
-            <wp:effectExtent l="0" t="0" r="13970" b="9525"/>
+            <wp:extent cx="3581400" cy="5737860"/>
+            <wp:effectExtent l="0" t="0" r="0" b="7620"/>
             <wp:wrapTight wrapText="bothSides">
               <wp:wrapPolygon>
                 <wp:start x="0" y="0"/>
-                <wp:lineTo x="0" y="21445"/>
-                <wp:lineTo x="21532" y="21445"/>
-                <wp:lineTo x="21532" y="0"/>
+                <wp:lineTo x="0" y="21571"/>
+                <wp:lineTo x="21508" y="21571"/>
+                <wp:lineTo x="21508" y="0"/>
                 <wp:lineTo x="0" y="0"/>
               </wp:wrapPolygon>
             </wp:wrapTight>
-            <wp:docPr id="4" name="Picture 5"/>
+            <wp:docPr id="29" name="Picture 2"/>
             <wp:cNvGraphicFramePr>
               <a:graphicFrameLocks xmlns:a="http://schemas.openxmlformats.org/drawingml/2006/main" noChangeAspect="1"/>
             </wp:cNvGraphicFramePr>
@@ -2521,7 +2622,7 @@
               <a:graphicData uri="http://schemas.openxmlformats.org/drawingml/2006/picture">
                 <pic:pic xmlns:pic="http://schemas.openxmlformats.org/drawingml/2006/picture">
                   <pic:nvPicPr>
-                    <pic:cNvPr id="4" name="Picture 5"/>
+                    <pic:cNvPr id="29" name="Picture 2"/>
                     <pic:cNvPicPr>
                       <a:picLocks noChangeAspect="1"/>
                     </pic:cNvPicPr>
@@ -2535,7 +2636,7 @@
                   <pic:spPr>
                     <a:xfrm>
                       <a:off x="0" y="0"/>
-                      <a:ext cx="5274310" cy="2916555"/>
+                      <a:ext cx="3581400" cy="5737860"/>
                     </a:xfrm>
                     <a:prstGeom prst="rect">
                       <a:avLst/>
@@ -2551,31 +2652,558 @@
           </wp:anchor>
         </w:drawing>
       </w:r>
-      <w:r>
-        <w:rPr>
-          <w:rFonts w:hint="default" w:ascii="Times New Roman" w:hAnsi="Times New Roman" w:eastAsia="SimSun" w:cs="Times New Roman"/>
-          <w:b/>
-          <w:bCs/>
-          <w:i/>
-          <w:iCs/>
-          <w:sz w:val="21"/>
-          <w:szCs w:val="21"/>
-          <w:lang w:val="en-US"/>
-        </w:rPr>
-        <w:t xml:space="preserve">Figure 4: </w:t>
-      </w:r>
-      <w:r>
-        <w:rPr>
-          <w:rFonts w:hint="default" w:ascii="Times New Roman" w:hAnsi="Times New Roman" w:eastAsia="SimSun" w:cs="Times New Roman"/>
-          <w:b/>
-          <w:bCs/>
-          <w:i/>
-          <w:iCs/>
-          <w:sz w:val="21"/>
-          <w:szCs w:val="21"/>
-        </w:rPr>
-        <w:t>Query Result Showing Male Actors from the ACTOR Table</w:t>
-      </w:r>
+    </w:p>
+    <w:p>
+      <w:pPr>
+        <w:keepNext w:val="0"/>
+        <w:keepLines w:val="0"/>
+        <w:widowControl/>
+        <w:suppressLineNumbers w:val="0"/>
+        <w:pBdr>
+          <w:bottom w:val="none" w:color="0A0A0A" w:sz="0" w:space="0"/>
+        </w:pBdr>
+        <w:spacing w:before="0" w:beforeAutospacing="0" w:after="144" w:afterAutospacing="0" w:line="240" w:lineRule="auto"/>
+        <w:ind w:left="0" w:right="0"/>
+        <w:jc w:val="center"/>
+        <w:rPr>
+          <w:rFonts w:hint="default" w:ascii="Times New Roman" w:hAnsi="Times New Roman" w:eastAsia="SimSun" w:cs="Times New Roman"/>
+          <w:b/>
+          <w:bCs/>
+          <w:i/>
+          <w:iCs/>
+          <w:sz w:val="21"/>
+          <w:szCs w:val="21"/>
+        </w:rPr>
+      </w:pPr>
+    </w:p>
+    <w:p>
+      <w:pPr>
+        <w:keepNext w:val="0"/>
+        <w:keepLines w:val="0"/>
+        <w:widowControl/>
+        <w:suppressLineNumbers w:val="0"/>
+        <w:pBdr>
+          <w:bottom w:val="none" w:color="0A0A0A" w:sz="0" w:space="0"/>
+        </w:pBdr>
+        <w:spacing w:before="0" w:beforeAutospacing="0" w:after="144" w:afterAutospacing="0" w:line="240" w:lineRule="auto"/>
+        <w:ind w:left="0" w:right="0"/>
+        <w:jc w:val="center"/>
+        <w:rPr>
+          <w:rFonts w:hint="default" w:ascii="Times New Roman" w:hAnsi="Times New Roman" w:eastAsia="SimSun" w:cs="Times New Roman"/>
+          <w:b/>
+          <w:bCs/>
+          <w:i/>
+          <w:iCs/>
+          <w:sz w:val="21"/>
+          <w:szCs w:val="21"/>
+        </w:rPr>
+      </w:pPr>
+    </w:p>
+    <w:p>
+      <w:pPr>
+        <w:keepNext w:val="0"/>
+        <w:keepLines w:val="0"/>
+        <w:widowControl/>
+        <w:suppressLineNumbers w:val="0"/>
+        <w:pBdr>
+          <w:bottom w:val="none" w:color="0A0A0A" w:sz="0" w:space="0"/>
+        </w:pBdr>
+        <w:spacing w:before="0" w:beforeAutospacing="0" w:after="144" w:afterAutospacing="0" w:line="240" w:lineRule="auto"/>
+        <w:ind w:left="0" w:right="0"/>
+        <w:jc w:val="center"/>
+        <w:rPr>
+          <w:rFonts w:hint="default" w:ascii="Times New Roman" w:hAnsi="Times New Roman" w:eastAsia="SimSun" w:cs="Times New Roman"/>
+          <w:b/>
+          <w:bCs/>
+          <w:i/>
+          <w:iCs/>
+          <w:sz w:val="21"/>
+          <w:szCs w:val="21"/>
+        </w:rPr>
+      </w:pPr>
+    </w:p>
+    <w:p>
+      <w:pPr>
+        <w:keepNext w:val="0"/>
+        <w:keepLines w:val="0"/>
+        <w:widowControl/>
+        <w:suppressLineNumbers w:val="0"/>
+        <w:pBdr>
+          <w:bottom w:val="none" w:color="0A0A0A" w:sz="0" w:space="0"/>
+        </w:pBdr>
+        <w:spacing w:before="0" w:beforeAutospacing="0" w:after="144" w:afterAutospacing="0" w:line="240" w:lineRule="auto"/>
+        <w:ind w:left="0" w:right="0"/>
+        <w:jc w:val="center"/>
+        <w:rPr>
+          <w:rFonts w:hint="default" w:ascii="Times New Roman" w:hAnsi="Times New Roman" w:eastAsia="SimSun" w:cs="Times New Roman"/>
+          <w:b/>
+          <w:bCs/>
+          <w:i/>
+          <w:iCs/>
+          <w:sz w:val="21"/>
+          <w:szCs w:val="21"/>
+        </w:rPr>
+      </w:pPr>
+    </w:p>
+    <w:p>
+      <w:pPr>
+        <w:keepNext w:val="0"/>
+        <w:keepLines w:val="0"/>
+        <w:widowControl/>
+        <w:suppressLineNumbers w:val="0"/>
+        <w:pBdr>
+          <w:bottom w:val="none" w:color="0A0A0A" w:sz="0" w:space="0"/>
+        </w:pBdr>
+        <w:spacing w:before="0" w:beforeAutospacing="0" w:after="144" w:afterAutospacing="0" w:line="240" w:lineRule="auto"/>
+        <w:ind w:left="0" w:right="0"/>
+        <w:jc w:val="center"/>
+        <w:rPr>
+          <w:rFonts w:hint="default" w:ascii="Times New Roman" w:hAnsi="Times New Roman" w:eastAsia="SimSun" w:cs="Times New Roman"/>
+          <w:b/>
+          <w:bCs/>
+          <w:i/>
+          <w:iCs/>
+          <w:sz w:val="21"/>
+          <w:szCs w:val="21"/>
+        </w:rPr>
+      </w:pPr>
+    </w:p>
+    <w:p>
+      <w:pPr>
+        <w:keepNext w:val="0"/>
+        <w:keepLines w:val="0"/>
+        <w:widowControl/>
+        <w:suppressLineNumbers w:val="0"/>
+        <w:pBdr>
+          <w:bottom w:val="none" w:color="0A0A0A" w:sz="0" w:space="0"/>
+        </w:pBdr>
+        <w:spacing w:before="0" w:beforeAutospacing="0" w:after="144" w:afterAutospacing="0" w:line="240" w:lineRule="auto"/>
+        <w:ind w:left="0" w:right="0"/>
+        <w:jc w:val="center"/>
+        <w:rPr>
+          <w:rFonts w:hint="default" w:ascii="Times New Roman" w:hAnsi="Times New Roman" w:eastAsia="SimSun" w:cs="Times New Roman"/>
+          <w:b/>
+          <w:bCs/>
+          <w:i/>
+          <w:iCs/>
+          <w:sz w:val="21"/>
+          <w:szCs w:val="21"/>
+        </w:rPr>
+      </w:pPr>
+    </w:p>
+    <w:p>
+      <w:pPr>
+        <w:keepNext w:val="0"/>
+        <w:keepLines w:val="0"/>
+        <w:widowControl/>
+        <w:suppressLineNumbers w:val="0"/>
+        <w:pBdr>
+          <w:bottom w:val="none" w:color="0A0A0A" w:sz="0" w:space="0"/>
+        </w:pBdr>
+        <w:spacing w:before="0" w:beforeAutospacing="0" w:after="144" w:afterAutospacing="0" w:line="240" w:lineRule="auto"/>
+        <w:ind w:left="0" w:right="0"/>
+        <w:jc w:val="center"/>
+        <w:rPr>
+          <w:rFonts w:hint="default" w:ascii="Times New Roman" w:hAnsi="Times New Roman" w:eastAsia="SimSun" w:cs="Times New Roman"/>
+          <w:b/>
+          <w:bCs/>
+          <w:i/>
+          <w:iCs/>
+          <w:sz w:val="21"/>
+          <w:szCs w:val="21"/>
+        </w:rPr>
+      </w:pPr>
+    </w:p>
+    <w:p>
+      <w:pPr>
+        <w:keepNext w:val="0"/>
+        <w:keepLines w:val="0"/>
+        <w:widowControl/>
+        <w:suppressLineNumbers w:val="0"/>
+        <w:pBdr>
+          <w:bottom w:val="none" w:color="0A0A0A" w:sz="0" w:space="0"/>
+        </w:pBdr>
+        <w:spacing w:before="0" w:beforeAutospacing="0" w:after="144" w:afterAutospacing="0" w:line="240" w:lineRule="auto"/>
+        <w:ind w:left="0" w:right="0"/>
+        <w:jc w:val="center"/>
+        <w:rPr>
+          <w:rFonts w:hint="default" w:ascii="Times New Roman" w:hAnsi="Times New Roman" w:eastAsia="SimSun" w:cs="Times New Roman"/>
+          <w:b/>
+          <w:bCs/>
+          <w:i/>
+          <w:iCs/>
+          <w:sz w:val="21"/>
+          <w:szCs w:val="21"/>
+        </w:rPr>
+      </w:pPr>
+    </w:p>
+    <w:p>
+      <w:pPr>
+        <w:keepNext w:val="0"/>
+        <w:keepLines w:val="0"/>
+        <w:widowControl/>
+        <w:suppressLineNumbers w:val="0"/>
+        <w:pBdr>
+          <w:bottom w:val="none" w:color="0A0A0A" w:sz="0" w:space="0"/>
+        </w:pBdr>
+        <w:spacing w:before="0" w:beforeAutospacing="0" w:after="144" w:afterAutospacing="0" w:line="240" w:lineRule="auto"/>
+        <w:ind w:left="0" w:right="0"/>
+        <w:jc w:val="center"/>
+        <w:rPr>
+          <w:rFonts w:hint="default" w:ascii="Times New Roman" w:hAnsi="Times New Roman" w:eastAsia="SimSun" w:cs="Times New Roman"/>
+          <w:b/>
+          <w:bCs/>
+          <w:i/>
+          <w:iCs/>
+          <w:sz w:val="21"/>
+          <w:szCs w:val="21"/>
+        </w:rPr>
+      </w:pPr>
+    </w:p>
+    <w:p>
+      <w:pPr>
+        <w:keepNext w:val="0"/>
+        <w:keepLines w:val="0"/>
+        <w:widowControl/>
+        <w:suppressLineNumbers w:val="0"/>
+        <w:pBdr>
+          <w:bottom w:val="none" w:color="0A0A0A" w:sz="0" w:space="0"/>
+        </w:pBdr>
+        <w:spacing w:before="0" w:beforeAutospacing="0" w:after="144" w:afterAutospacing="0" w:line="240" w:lineRule="auto"/>
+        <w:ind w:left="0" w:right="0"/>
+        <w:jc w:val="center"/>
+        <w:rPr>
+          <w:rFonts w:hint="default" w:ascii="Times New Roman" w:hAnsi="Times New Roman" w:eastAsia="SimSun" w:cs="Times New Roman"/>
+          <w:b/>
+          <w:bCs/>
+          <w:i/>
+          <w:iCs/>
+          <w:sz w:val="21"/>
+          <w:szCs w:val="21"/>
+        </w:rPr>
+      </w:pPr>
+    </w:p>
+    <w:p>
+      <w:pPr>
+        <w:keepNext w:val="0"/>
+        <w:keepLines w:val="0"/>
+        <w:widowControl/>
+        <w:suppressLineNumbers w:val="0"/>
+        <w:pBdr>
+          <w:bottom w:val="none" w:color="0A0A0A" w:sz="0" w:space="0"/>
+        </w:pBdr>
+        <w:spacing w:before="0" w:beforeAutospacing="0" w:after="144" w:afterAutospacing="0" w:line="240" w:lineRule="auto"/>
+        <w:ind w:left="0" w:right="0"/>
+        <w:jc w:val="center"/>
+        <w:rPr>
+          <w:rFonts w:hint="default" w:ascii="Times New Roman" w:hAnsi="Times New Roman" w:eastAsia="SimSun" w:cs="Times New Roman"/>
+          <w:b/>
+          <w:bCs/>
+          <w:i/>
+          <w:iCs/>
+          <w:sz w:val="21"/>
+          <w:szCs w:val="21"/>
+        </w:rPr>
+      </w:pPr>
+    </w:p>
+    <w:p>
+      <w:pPr>
+        <w:keepNext w:val="0"/>
+        <w:keepLines w:val="0"/>
+        <w:widowControl/>
+        <w:suppressLineNumbers w:val="0"/>
+        <w:pBdr>
+          <w:bottom w:val="none" w:color="0A0A0A" w:sz="0" w:space="0"/>
+        </w:pBdr>
+        <w:spacing w:before="0" w:beforeAutospacing="0" w:after="144" w:afterAutospacing="0" w:line="240" w:lineRule="auto"/>
+        <w:ind w:left="0" w:right="0"/>
+        <w:jc w:val="center"/>
+        <w:rPr>
+          <w:rFonts w:hint="default" w:ascii="Times New Roman" w:hAnsi="Times New Roman" w:eastAsia="SimSun" w:cs="Times New Roman"/>
+          <w:b/>
+          <w:bCs/>
+          <w:i/>
+          <w:iCs/>
+          <w:sz w:val="21"/>
+          <w:szCs w:val="21"/>
+        </w:rPr>
+      </w:pPr>
+    </w:p>
+    <w:p>
+      <w:pPr>
+        <w:keepNext w:val="0"/>
+        <w:keepLines w:val="0"/>
+        <w:widowControl/>
+        <w:suppressLineNumbers w:val="0"/>
+        <w:pBdr>
+          <w:bottom w:val="none" w:color="0A0A0A" w:sz="0" w:space="0"/>
+        </w:pBdr>
+        <w:spacing w:before="0" w:beforeAutospacing="0" w:after="144" w:afterAutospacing="0" w:line="240" w:lineRule="auto"/>
+        <w:ind w:left="0" w:right="0"/>
+        <w:jc w:val="center"/>
+        <w:rPr>
+          <w:rFonts w:hint="default" w:ascii="Times New Roman" w:hAnsi="Times New Roman" w:eastAsia="SimSun" w:cs="Times New Roman"/>
+          <w:b/>
+          <w:bCs/>
+          <w:i/>
+          <w:iCs/>
+          <w:sz w:val="21"/>
+          <w:szCs w:val="21"/>
+        </w:rPr>
+      </w:pPr>
+    </w:p>
+    <w:p>
+      <w:pPr>
+        <w:keepNext w:val="0"/>
+        <w:keepLines w:val="0"/>
+        <w:widowControl/>
+        <w:suppressLineNumbers w:val="0"/>
+        <w:pBdr>
+          <w:bottom w:val="none" w:color="0A0A0A" w:sz="0" w:space="0"/>
+        </w:pBdr>
+        <w:spacing w:before="0" w:beforeAutospacing="0" w:after="144" w:afterAutospacing="0" w:line="240" w:lineRule="auto"/>
+        <w:ind w:left="0" w:right="0"/>
+        <w:jc w:val="center"/>
+        <w:rPr>
+          <w:rFonts w:hint="default" w:ascii="Times New Roman" w:hAnsi="Times New Roman" w:eastAsia="SimSun" w:cs="Times New Roman"/>
+          <w:b/>
+          <w:bCs/>
+          <w:i/>
+          <w:iCs/>
+          <w:sz w:val="21"/>
+          <w:szCs w:val="21"/>
+        </w:rPr>
+      </w:pPr>
+    </w:p>
+    <w:p>
+      <w:pPr>
+        <w:keepNext w:val="0"/>
+        <w:keepLines w:val="0"/>
+        <w:widowControl/>
+        <w:suppressLineNumbers w:val="0"/>
+        <w:pBdr>
+          <w:bottom w:val="none" w:color="0A0A0A" w:sz="0" w:space="0"/>
+        </w:pBdr>
+        <w:spacing w:before="0" w:beforeAutospacing="0" w:after="144" w:afterAutospacing="0" w:line="240" w:lineRule="auto"/>
+        <w:ind w:left="0" w:right="0"/>
+        <w:jc w:val="center"/>
+        <w:rPr>
+          <w:rFonts w:hint="default" w:ascii="Times New Roman" w:hAnsi="Times New Roman" w:eastAsia="SimSun" w:cs="Times New Roman"/>
+          <w:b/>
+          <w:bCs/>
+          <w:i/>
+          <w:iCs/>
+          <w:sz w:val="21"/>
+          <w:szCs w:val="21"/>
+        </w:rPr>
+      </w:pPr>
+    </w:p>
+    <w:p>
+      <w:pPr>
+        <w:keepNext w:val="0"/>
+        <w:keepLines w:val="0"/>
+        <w:widowControl/>
+        <w:suppressLineNumbers w:val="0"/>
+        <w:pBdr>
+          <w:bottom w:val="none" w:color="0A0A0A" w:sz="0" w:space="0"/>
+        </w:pBdr>
+        <w:spacing w:before="0" w:beforeAutospacing="0" w:after="144" w:afterAutospacing="0" w:line="240" w:lineRule="auto"/>
+        <w:ind w:left="0" w:right="0"/>
+        <w:jc w:val="center"/>
+        <w:rPr>
+          <w:rFonts w:hint="default" w:ascii="Times New Roman" w:hAnsi="Times New Roman" w:eastAsia="SimSun" w:cs="Times New Roman"/>
+          <w:b/>
+          <w:bCs/>
+          <w:i/>
+          <w:iCs/>
+          <w:sz w:val="21"/>
+          <w:szCs w:val="21"/>
+        </w:rPr>
+      </w:pPr>
+    </w:p>
+    <w:p>
+      <w:pPr>
+        <w:keepNext w:val="0"/>
+        <w:keepLines w:val="0"/>
+        <w:widowControl/>
+        <w:suppressLineNumbers w:val="0"/>
+        <w:pBdr>
+          <w:bottom w:val="none" w:color="0A0A0A" w:sz="0" w:space="0"/>
+        </w:pBdr>
+        <w:spacing w:before="0" w:beforeAutospacing="0" w:after="144" w:afterAutospacing="0" w:line="240" w:lineRule="auto"/>
+        <w:ind w:left="0" w:right="0"/>
+        <w:jc w:val="center"/>
+        <w:rPr>
+          <w:rFonts w:hint="default" w:ascii="Times New Roman" w:hAnsi="Times New Roman" w:eastAsia="SimSun" w:cs="Times New Roman"/>
+          <w:b/>
+          <w:bCs/>
+          <w:i/>
+          <w:iCs/>
+          <w:sz w:val="21"/>
+          <w:szCs w:val="21"/>
+        </w:rPr>
+      </w:pPr>
+    </w:p>
+    <w:p>
+      <w:pPr>
+        <w:keepNext w:val="0"/>
+        <w:keepLines w:val="0"/>
+        <w:widowControl/>
+        <w:suppressLineNumbers w:val="0"/>
+        <w:pBdr>
+          <w:bottom w:val="none" w:color="0A0A0A" w:sz="0" w:space="0"/>
+        </w:pBdr>
+        <w:spacing w:before="0" w:beforeAutospacing="0" w:after="144" w:afterAutospacing="0" w:line="240" w:lineRule="auto"/>
+        <w:ind w:left="0" w:right="0"/>
+        <w:jc w:val="center"/>
+        <w:rPr>
+          <w:rFonts w:hint="default" w:ascii="Times New Roman" w:hAnsi="Times New Roman" w:eastAsia="SimSun" w:cs="Times New Roman"/>
+          <w:b/>
+          <w:bCs/>
+          <w:i/>
+          <w:iCs/>
+          <w:sz w:val="21"/>
+          <w:szCs w:val="21"/>
+        </w:rPr>
+      </w:pPr>
+    </w:p>
+    <w:p>
+      <w:pPr>
+        <w:keepNext w:val="0"/>
+        <w:keepLines w:val="0"/>
+        <w:widowControl/>
+        <w:suppressLineNumbers w:val="0"/>
+        <w:pBdr>
+          <w:bottom w:val="none" w:color="0A0A0A" w:sz="0" w:space="0"/>
+        </w:pBdr>
+        <w:spacing w:before="0" w:beforeAutospacing="0" w:after="144" w:afterAutospacing="0" w:line="240" w:lineRule="auto"/>
+        <w:ind w:left="0" w:right="0"/>
+        <w:jc w:val="center"/>
+        <w:rPr>
+          <w:rFonts w:hint="default" w:ascii="Times New Roman" w:hAnsi="Times New Roman" w:eastAsia="SimSun" w:cs="Times New Roman"/>
+          <w:b/>
+          <w:bCs/>
+          <w:i/>
+          <w:iCs/>
+          <w:sz w:val="21"/>
+          <w:szCs w:val="21"/>
+        </w:rPr>
+      </w:pPr>
+    </w:p>
+    <w:p>
+      <w:pPr>
+        <w:keepNext w:val="0"/>
+        <w:keepLines w:val="0"/>
+        <w:widowControl/>
+        <w:suppressLineNumbers w:val="0"/>
+        <w:pBdr>
+          <w:bottom w:val="none" w:color="0A0A0A" w:sz="0" w:space="0"/>
+        </w:pBdr>
+        <w:spacing w:before="0" w:beforeAutospacing="0" w:after="144" w:afterAutospacing="0" w:line="240" w:lineRule="auto"/>
+        <w:ind w:left="0" w:right="0"/>
+        <w:jc w:val="center"/>
+        <w:rPr>
+          <w:rFonts w:hint="default" w:ascii="Times New Roman" w:hAnsi="Times New Roman" w:eastAsia="SimSun" w:cs="Times New Roman"/>
+          <w:b/>
+          <w:bCs/>
+          <w:i/>
+          <w:iCs/>
+          <w:sz w:val="21"/>
+          <w:szCs w:val="21"/>
+        </w:rPr>
+      </w:pPr>
+    </w:p>
+    <w:p>
+      <w:pPr>
+        <w:keepNext w:val="0"/>
+        <w:keepLines w:val="0"/>
+        <w:widowControl/>
+        <w:suppressLineNumbers w:val="0"/>
+        <w:pBdr>
+          <w:bottom w:val="none" w:color="0A0A0A" w:sz="0" w:space="0"/>
+        </w:pBdr>
+        <w:spacing w:before="0" w:beforeAutospacing="0" w:after="144" w:afterAutospacing="0" w:line="240" w:lineRule="auto"/>
+        <w:ind w:left="0" w:right="0"/>
+        <w:jc w:val="center"/>
+        <w:rPr>
+          <w:rFonts w:hint="default" w:ascii="Times New Roman" w:hAnsi="Times New Roman" w:eastAsia="SimSun" w:cs="Times New Roman"/>
+          <w:b/>
+          <w:bCs/>
+          <w:i/>
+          <w:iCs/>
+          <w:sz w:val="21"/>
+          <w:szCs w:val="21"/>
+        </w:rPr>
+      </w:pPr>
+    </w:p>
+    <w:p>
+      <w:pPr>
+        <w:keepNext w:val="0"/>
+        <w:keepLines w:val="0"/>
+        <w:widowControl/>
+        <w:suppressLineNumbers w:val="0"/>
+        <w:pBdr>
+          <w:bottom w:val="none" w:color="0A0A0A" w:sz="0" w:space="0"/>
+        </w:pBdr>
+        <w:spacing w:before="0" w:beforeAutospacing="0" w:after="144" w:afterAutospacing="0" w:line="240" w:lineRule="auto"/>
+        <w:ind w:left="0" w:right="0"/>
+        <w:jc w:val="center"/>
+        <w:rPr>
+          <w:rFonts w:hint="default" w:ascii="Times New Roman" w:hAnsi="Times New Roman" w:eastAsia="SimSun" w:cs="Times New Roman"/>
+          <w:b/>
+          <w:bCs/>
+          <w:i/>
+          <w:iCs/>
+          <w:sz w:val="21"/>
+          <w:szCs w:val="21"/>
+        </w:rPr>
+      </w:pPr>
+    </w:p>
+    <w:p>
+      <w:pPr>
+        <w:keepNext w:val="0"/>
+        <w:keepLines w:val="0"/>
+        <w:widowControl/>
+        <w:suppressLineNumbers w:val="0"/>
+        <w:pBdr>
+          <w:bottom w:val="none" w:color="0A0A0A" w:sz="0" w:space="0"/>
+        </w:pBdr>
+        <w:spacing w:before="0" w:beforeAutospacing="0" w:after="144" w:afterAutospacing="0" w:line="240" w:lineRule="auto"/>
+        <w:ind w:left="0" w:right="0"/>
+        <w:jc w:val="center"/>
+        <w:rPr>
+          <w:rFonts w:hint="default" w:ascii="Times New Roman" w:hAnsi="Times New Roman" w:eastAsia="SimSun" w:cs="Times New Roman"/>
+          <w:b/>
+          <w:bCs/>
+          <w:i/>
+          <w:iCs/>
+          <w:sz w:val="21"/>
+          <w:szCs w:val="21"/>
+        </w:rPr>
+      </w:pPr>
+    </w:p>
+    <w:p>
+      <w:pPr>
+        <w:keepNext w:val="0"/>
+        <w:keepLines w:val="0"/>
+        <w:widowControl/>
+        <w:suppressLineNumbers w:val="0"/>
+        <w:pBdr>
+          <w:bottom w:val="none" w:color="0A0A0A" w:sz="0" w:space="0"/>
+        </w:pBdr>
+        <w:spacing w:before="0" w:beforeAutospacing="0" w:after="144" w:afterAutospacing="0" w:line="240" w:lineRule="auto"/>
+        <w:ind w:left="0" w:leftChars="0" w:right="0" w:firstLine="0" w:firstLineChars="0"/>
+        <w:jc w:val="both"/>
+        <w:rPr>
+          <w:rFonts w:hint="default" w:ascii="Times New Roman" w:hAnsi="Times New Roman" w:eastAsia="SimSun" w:cs="Times New Roman"/>
+          <w:b/>
+          <w:bCs/>
+          <w:i/>
+          <w:iCs/>
+          <w:sz w:val="21"/>
+          <w:szCs w:val="21"/>
+        </w:rPr>
+      </w:pPr>
     </w:p>
     <w:p>
       <w:pPr>
@@ -2599,6 +3227,54 @@
           <w:szCs w:val="21"/>
         </w:rPr>
       </w:pPr>
+      <w:r>
+        <w:rPr>
+          <w:rFonts w:hint="default" w:ascii="Times New Roman" w:hAnsi="Times New Roman" w:eastAsia="SimSun" w:cs="Times New Roman"/>
+          <w:b/>
+          <w:bCs/>
+          <w:i/>
+          <w:iCs/>
+          <w:sz w:val="21"/>
+          <w:szCs w:val="21"/>
+          <w:lang w:val="en-US"/>
+        </w:rPr>
+        <w:t xml:space="preserve">Figure 4: </w:t>
+      </w:r>
+      <w:r>
+        <w:rPr>
+          <w:rFonts w:hint="default" w:ascii="Times New Roman" w:hAnsi="Times New Roman" w:eastAsia="SimSun" w:cs="Times New Roman"/>
+          <w:b/>
+          <w:bCs/>
+          <w:i/>
+          <w:iCs/>
+          <w:sz w:val="21"/>
+          <w:szCs w:val="21"/>
+        </w:rPr>
+        <w:t>Query Result Showing Male Actors from the ACTOR Table</w:t>
+      </w:r>
+    </w:p>
+    <w:p>
+      <w:pPr>
+        <w:keepNext w:val="0"/>
+        <w:keepLines w:val="0"/>
+        <w:widowControl/>
+        <w:suppressLineNumbers w:val="0"/>
+        <w:pBdr>
+          <w:bottom w:val="single" w:color="auto" w:sz="4" w:space="0"/>
+        </w:pBdr>
+        <w:spacing w:before="0" w:beforeAutospacing="0" w:after="144" w:afterAutospacing="0" w:line="240" w:lineRule="auto"/>
+        <w:ind w:left="0" w:right="0"/>
+        <w:jc w:val="center"/>
+        <w:rPr>
+          <w:rFonts w:hint="default" w:ascii="Times New Roman" w:hAnsi="Times New Roman" w:eastAsia="SimSun" w:cs="Times New Roman"/>
+          <w:b/>
+          <w:bCs/>
+          <w:i/>
+          <w:iCs/>
+          <w:sz w:val="21"/>
+          <w:szCs w:val="21"/>
+        </w:rPr>
+      </w:pPr>
     </w:p>
     <w:p>
       <w:pPr>
@@ -2659,7 +3335,254 @@
           <w:szCs w:val="25"/>
           <w:lang w:val="en-US"/>
         </w:rPr>
-        <w:t>After downloading the file moviedatasetDAD.accdb, I changed namd following files including ACTOR, CASTING, COLOURTYPE, MOVIE, RATING into ACTOR5520, CASTING5520, COLOURTYPE5520, MOVIE5520, RATING5520</w:t>
+        <w:t xml:space="preserve">After downloading the file moviedatasetDAD.accdb, I changed namd following files including </w:t>
+      </w:r>
+      <w:r>
+        <w:rPr>
+          <w:rFonts w:hint="default" w:ascii="Times New Roman" w:hAnsi="Times New Roman" w:eastAsia="SimSun" w:cs="Times New Roman"/>
+          <w:b/>
+          <w:bCs/>
+          <w:i/>
+          <w:iCs/>
+          <w:sz w:val="25"/>
+          <w:szCs w:val="25"/>
+          <w:lang w:val="en-US"/>
+        </w:rPr>
+        <w:t>ACTOR</w:t>
+      </w:r>
+      <w:r>
+        <w:rPr>
+          <w:rFonts w:hint="default" w:ascii="Times New Roman" w:hAnsi="Times New Roman" w:eastAsia="SimSun" w:cs="Times New Roman"/>
+          <w:b w:val="0"/>
+          <w:bCs w:val="0"/>
+          <w:i w:val="0"/>
+          <w:iCs w:val="0"/>
+          <w:sz w:val="25"/>
+          <w:szCs w:val="25"/>
+          <w:lang w:val="en-US"/>
+        </w:rPr>
+        <w:t xml:space="preserve">, </w:t>
+      </w:r>
+      <w:r>
+        <w:rPr>
+          <w:rFonts w:hint="default" w:ascii="Times New Roman" w:hAnsi="Times New Roman" w:eastAsia="SimSun" w:cs="Times New Roman"/>
+          <w:b/>
+          <w:bCs/>
+          <w:i/>
+          <w:iCs/>
+          <w:sz w:val="25"/>
+          <w:szCs w:val="25"/>
+          <w:lang w:val="en-US"/>
+        </w:rPr>
+        <w:t>CASTING</w:t>
+      </w:r>
+      <w:r>
+        <w:rPr>
+          <w:rFonts w:hint="default" w:ascii="Times New Roman" w:hAnsi="Times New Roman" w:eastAsia="SimSun" w:cs="Times New Roman"/>
+          <w:b w:val="0"/>
+          <w:bCs w:val="0"/>
+          <w:i w:val="0"/>
+          <w:iCs w:val="0"/>
+          <w:sz w:val="25"/>
+          <w:szCs w:val="25"/>
+          <w:lang w:val="en-US"/>
+        </w:rPr>
+        <w:t xml:space="preserve">, </w:t>
+      </w:r>
+      <w:r>
+        <w:rPr>
+          <w:rFonts w:hint="default" w:ascii="Times New Roman" w:hAnsi="Times New Roman" w:eastAsia="SimSun" w:cs="Times New Roman"/>
+          <w:b/>
+          <w:bCs/>
+          <w:i/>
+          <w:iCs/>
+          <w:sz w:val="25"/>
+          <w:szCs w:val="25"/>
+          <w:lang w:val="en-US"/>
+        </w:rPr>
+        <w:t>COLOURTYPE</w:t>
+      </w:r>
+      <w:r>
+        <w:rPr>
+          <w:rFonts w:hint="default" w:ascii="Times New Roman" w:hAnsi="Times New Roman" w:eastAsia="SimSun" w:cs="Times New Roman"/>
+          <w:b w:val="0"/>
+          <w:bCs w:val="0"/>
+          <w:i w:val="0"/>
+          <w:iCs w:val="0"/>
+          <w:sz w:val="25"/>
+          <w:szCs w:val="25"/>
+          <w:lang w:val="en-US"/>
+        </w:rPr>
+        <w:t xml:space="preserve">, </w:t>
+      </w:r>
+      <w:r>
+        <w:rPr>
+          <w:rFonts w:hint="default" w:ascii="Times New Roman" w:hAnsi="Times New Roman" w:eastAsia="SimSun" w:cs="Times New Roman"/>
+          <w:b/>
+          <w:bCs/>
+          <w:i/>
+          <w:iCs/>
+          <w:sz w:val="25"/>
+          <w:szCs w:val="25"/>
+          <w:lang w:val="en-US"/>
+        </w:rPr>
+        <w:t>MOVIE</w:t>
+      </w:r>
+      <w:r>
+        <w:rPr>
+          <w:rFonts w:hint="default" w:ascii="Times New Roman" w:hAnsi="Times New Roman" w:eastAsia="SimSun" w:cs="Times New Roman"/>
+          <w:b w:val="0"/>
+          <w:bCs w:val="0"/>
+          <w:i w:val="0"/>
+          <w:iCs w:val="0"/>
+          <w:sz w:val="25"/>
+          <w:szCs w:val="25"/>
+          <w:lang w:val="en-US"/>
+        </w:rPr>
+        <w:t xml:space="preserve">, </w:t>
+      </w:r>
+      <w:r>
+        <w:rPr>
+          <w:rFonts w:hint="default" w:ascii="Times New Roman" w:hAnsi="Times New Roman" w:eastAsia="SimSun" w:cs="Times New Roman"/>
+          <w:b/>
+          <w:bCs/>
+          <w:i/>
+          <w:iCs/>
+          <w:sz w:val="25"/>
+          <w:szCs w:val="25"/>
+          <w:lang w:val="en-US"/>
+        </w:rPr>
+        <w:t>RATING</w:t>
+      </w:r>
+      <w:r>
+        <w:rPr>
+          <w:rFonts w:hint="default" w:ascii="Times New Roman" w:hAnsi="Times New Roman" w:eastAsia="SimSun" w:cs="Times New Roman"/>
+          <w:b w:val="0"/>
+          <w:bCs w:val="0"/>
+          <w:i w:val="0"/>
+          <w:iCs w:val="0"/>
+          <w:sz w:val="25"/>
+          <w:szCs w:val="25"/>
+          <w:lang w:val="en-US"/>
+        </w:rPr>
+        <w:t xml:space="preserve"> into </w:t>
+      </w:r>
+      <w:r>
+        <w:rPr>
+          <w:rFonts w:hint="default" w:ascii="Times New Roman" w:hAnsi="Times New Roman" w:eastAsia="SimSun" w:cs="Times New Roman"/>
+          <w:b/>
+          <w:bCs/>
+          <w:i/>
+          <w:iCs/>
+          <w:sz w:val="25"/>
+          <w:szCs w:val="25"/>
+          <w:lang w:val="en-US"/>
+        </w:rPr>
+        <w:t>ACTOR5520</w:t>
+      </w:r>
+      <w:r>
+        <w:rPr>
+          <w:rFonts w:hint="default" w:ascii="Times New Roman" w:hAnsi="Times New Roman" w:eastAsia="SimSun" w:cs="Times New Roman"/>
+          <w:b w:val="0"/>
+          <w:bCs w:val="0"/>
+          <w:i w:val="0"/>
+          <w:iCs w:val="0"/>
+          <w:sz w:val="25"/>
+          <w:szCs w:val="25"/>
+          <w:lang w:val="en-US"/>
+        </w:rPr>
+        <w:t xml:space="preserve">, </w:t>
+      </w:r>
+      <w:r>
+        <w:rPr>
+          <w:rFonts w:hint="default" w:ascii="Times New Roman" w:hAnsi="Times New Roman" w:eastAsia="SimSun" w:cs="Times New Roman"/>
+          <w:b/>
+          <w:bCs/>
+          <w:i/>
+          <w:iCs/>
+          <w:sz w:val="25"/>
+          <w:szCs w:val="25"/>
+          <w:lang w:val="en-US"/>
+        </w:rPr>
+        <w:t>CASTING5520</w:t>
+      </w:r>
+      <w:r>
+        <w:rPr>
+          <w:rFonts w:hint="default" w:ascii="Times New Roman" w:hAnsi="Times New Roman" w:eastAsia="SimSun" w:cs="Times New Roman"/>
+          <w:b w:val="0"/>
+          <w:bCs w:val="0"/>
+          <w:i w:val="0"/>
+          <w:iCs w:val="0"/>
+          <w:sz w:val="25"/>
+          <w:szCs w:val="25"/>
+          <w:lang w:val="en-US"/>
+        </w:rPr>
+        <w:t xml:space="preserve">, </w:t>
+      </w:r>
+      <w:r>
+        <w:rPr>
+          <w:rFonts w:hint="default" w:ascii="Times New Roman" w:hAnsi="Times New Roman" w:eastAsia="SimSun" w:cs="Times New Roman"/>
+          <w:b/>
+          <w:bCs/>
+          <w:i/>
+          <w:iCs/>
+          <w:sz w:val="25"/>
+          <w:szCs w:val="25"/>
+          <w:lang w:val="en-US"/>
+        </w:rPr>
+        <w:t>COLOURTYPE5520</w:t>
+      </w:r>
+      <w:r>
+        <w:rPr>
+          <w:rFonts w:hint="default" w:ascii="Times New Roman" w:hAnsi="Times New Roman" w:eastAsia="SimSun" w:cs="Times New Roman"/>
+          <w:b w:val="0"/>
+          <w:bCs w:val="0"/>
+          <w:i w:val="0"/>
+          <w:iCs w:val="0"/>
+          <w:sz w:val="25"/>
+          <w:szCs w:val="25"/>
+          <w:lang w:val="en-US"/>
+        </w:rPr>
+        <w:t xml:space="preserve">, </w:t>
+      </w:r>
+      <w:r>
+        <w:rPr>
+          <w:rFonts w:hint="default" w:ascii="Times New Roman" w:hAnsi="Times New Roman" w:eastAsia="SimSun" w:cs="Times New Roman"/>
+          <w:b/>
+          <w:bCs/>
+          <w:i/>
+          <w:iCs/>
+          <w:sz w:val="25"/>
+          <w:szCs w:val="25"/>
+          <w:lang w:val="en-US"/>
+        </w:rPr>
+        <w:t>MOVIE5520</w:t>
+      </w:r>
+      <w:r>
+        <w:rPr>
+          <w:rFonts w:hint="default" w:ascii="Times New Roman" w:hAnsi="Times New Roman" w:eastAsia="SimSun" w:cs="Times New Roman"/>
+          <w:b w:val="0"/>
+          <w:bCs w:val="0"/>
+          <w:i w:val="0"/>
+          <w:iCs w:val="0"/>
+          <w:sz w:val="25"/>
+          <w:szCs w:val="25"/>
+          <w:lang w:val="en-US"/>
+        </w:rPr>
+        <w:t xml:space="preserve">, and </w:t>
+      </w:r>
+      <w:r>
+        <w:rPr>
+          <w:rFonts w:hint="default" w:ascii="Times New Roman" w:hAnsi="Times New Roman" w:eastAsia="SimSun" w:cs="Times New Roman"/>
+          <w:b/>
+          <w:bCs/>
+          <w:i/>
+          <w:iCs/>
+          <w:sz w:val="25"/>
+          <w:szCs w:val="25"/>
+          <w:lang w:val="en-US"/>
+        </w:rPr>
+        <w:t>RATING5520.</w:t>
       </w:r>
     </w:p>
     <w:p>
@@ -2683,7 +3606,7 @@
       </w:pPr>
       <w:r>
         <w:drawing>
-          <wp:anchor distT="0" distB="0" distL="114300" distR="114300" simplePos="0" relativeHeight="251663360" behindDoc="1" locked="0" layoutInCell="1" allowOverlap="1">
+          <wp:anchor distT="0" distB="0" distL="114300" distR="114300" simplePos="0" relativeHeight="251661312" behindDoc="1" locked="0" layoutInCell="1" allowOverlap="1">
             <wp:simplePos x="0" y="0"/>
             <wp:positionH relativeFrom="column">
               <wp:posOffset>1627505</wp:posOffset>
@@ -2758,6 +3681,7 @@
           <w:iCs/>
           <w:sz w:val="21"/>
           <w:szCs w:val="21"/>
+          <w:lang w:val="en-US"/>
         </w:rPr>
       </w:pPr>
       <w:r>
@@ -2916,6 +3840,26 @@
         </w:rPr>
         <w:br w:type="textWrapping"/>
       </w:r>
+    </w:p>
+    <w:p>
+      <w:pPr>
+        <w:numPr>
+          <w:ilvl w:val="0"/>
+          <w:numId w:val="0"/>
+        </w:numPr>
+        <w:spacing w:line="240" w:lineRule="auto"/>
+        <w:ind w:leftChars="0"/>
+        <w:jc w:val="center"/>
+        <w:rPr>
+          <w:rFonts w:hint="default" w:ascii="Times New Roman" w:hAnsi="Times New Roman" w:eastAsia="SimSun" w:cs="Times New Roman"/>
+          <w:b/>
+          <w:bCs/>
+          <w:i/>
+          <w:iCs/>
+          <w:sz w:val="21"/>
+          <w:szCs w:val="21"/>
+        </w:rPr>
+      </w:pPr>
       <w:r>
         <w:rPr>
           <w:rFonts w:hint="default" w:ascii="Times New Roman" w:hAnsi="Times New Roman" w:eastAsia="SimSun" w:cs="Times New Roman"/>
@@ -2966,6 +3910,18 @@
         <w:jc w:val="both"/>
         <w:rPr>
           <w:rFonts w:hint="default" w:ascii="Times New Roman" w:hAnsi="Times New Roman" w:eastAsia="SimSun" w:cs="Times New Roman"/>
+          <w:b/>
+          <w:bCs/>
+          <w:i/>
+          <w:iCs/>
+          <w:sz w:val="25"/>
+          <w:szCs w:val="25"/>
+          <w:lang w:val="en-US"/>
+        </w:rPr>
+      </w:pPr>
+      <w:r>
+        <w:rPr>
+          <w:rFonts w:hint="default" w:ascii="Times New Roman" w:hAnsi="Times New Roman" w:eastAsia="SimSun" w:cs="Times New Roman"/>
           <w:b w:val="0"/>
           <w:bCs w:val="0"/>
           <w:i w:val="0"/>
@@ -2974,7 +3930,21 @@
           <w:szCs w:val="25"/>
           <w:lang w:val="en-US"/>
         </w:rPr>
-      </w:pPr>
+        <w:t xml:space="preserve">Next, according to query description, required field must be contain </w:t>
+      </w:r>
+      <w:r>
+        <w:rPr>
+          <w:rFonts w:hint="default" w:ascii="Times New Roman" w:hAnsi="Times New Roman" w:eastAsia="SimSun" w:cs="Times New Roman"/>
+          <w:b/>
+          <w:bCs/>
+          <w:i/>
+          <w:iCs/>
+          <w:sz w:val="25"/>
+          <w:szCs w:val="25"/>
+          <w:lang w:val="en-US"/>
+        </w:rPr>
+        <w:t>MOVIENO</w:t>
+      </w:r>
       <w:r>
         <w:rPr>
           <w:rFonts w:hint="default" w:ascii="Times New Roman" w:hAnsi="Times New Roman" w:eastAsia="SimSun" w:cs="Times New Roman"/>
@@ -2986,20 +3956,124 @@
           <w:szCs w:val="25"/>
           <w:lang w:val="en-US"/>
         </w:rPr>
-        <w:t xml:space="preserve">Next, according to query description, required field must be contain MOVIENO, TITLE, RATINGCODE, RELYEAR (Must be in 2012), RUNTIME (Descending Sort). After finishing query, save query to named </w:t>
-      </w:r>
-      <w:r>
-        <w:rPr>
-          <w:rFonts w:hint="default" w:ascii="Times New Roman" w:hAnsi="Times New Roman" w:eastAsia="SimSun" w:cs="Times New Roman"/>
-          <w:b/>
-          <w:bCs/>
-          <w:i/>
-          <w:iCs/>
-          <w:sz w:val="25"/>
-          <w:szCs w:val="25"/>
-          <w:lang w:val="en-US"/>
-        </w:rPr>
-        <w:t>T1PB_5520</w:t>
+        <w:t xml:space="preserve">, </w:t>
+      </w:r>
+      <w:r>
+        <w:rPr>
+          <w:rFonts w:hint="default" w:ascii="Times New Roman" w:hAnsi="Times New Roman" w:eastAsia="SimSun" w:cs="Times New Roman"/>
+          <w:b/>
+          <w:bCs/>
+          <w:i/>
+          <w:iCs/>
+          <w:sz w:val="25"/>
+          <w:szCs w:val="25"/>
+          <w:lang w:val="en-US"/>
+        </w:rPr>
+        <w:t>TITLE</w:t>
+      </w:r>
+      <w:r>
+        <w:rPr>
+          <w:rFonts w:hint="default" w:ascii="Times New Roman" w:hAnsi="Times New Roman" w:eastAsia="SimSun" w:cs="Times New Roman"/>
+          <w:b w:val="0"/>
+          <w:bCs w:val="0"/>
+          <w:i w:val="0"/>
+          <w:iCs w:val="0"/>
+          <w:sz w:val="25"/>
+          <w:szCs w:val="25"/>
+          <w:lang w:val="en-US"/>
+        </w:rPr>
+        <w:t xml:space="preserve">, </w:t>
+      </w:r>
+      <w:r>
+        <w:rPr>
+          <w:rFonts w:hint="default" w:ascii="Times New Roman" w:hAnsi="Times New Roman" w:eastAsia="SimSun" w:cs="Times New Roman"/>
+          <w:b/>
+          <w:bCs/>
+          <w:i/>
+          <w:iCs/>
+          <w:sz w:val="25"/>
+          <w:szCs w:val="25"/>
+          <w:lang w:val="en-US"/>
+        </w:rPr>
+        <w:t>RATINGCODE</w:t>
+      </w:r>
+      <w:r>
+        <w:rPr>
+          <w:rFonts w:hint="default" w:ascii="Times New Roman" w:hAnsi="Times New Roman" w:eastAsia="SimSun" w:cs="Times New Roman"/>
+          <w:b w:val="0"/>
+          <w:bCs w:val="0"/>
+          <w:i w:val="0"/>
+          <w:iCs w:val="0"/>
+          <w:sz w:val="25"/>
+          <w:szCs w:val="25"/>
+          <w:lang w:val="en-US"/>
+        </w:rPr>
+        <w:t xml:space="preserve">, </w:t>
+      </w:r>
+      <w:r>
+        <w:rPr>
+          <w:rFonts w:hint="default" w:ascii="Times New Roman" w:hAnsi="Times New Roman" w:eastAsia="SimSun" w:cs="Times New Roman"/>
+          <w:b/>
+          <w:bCs/>
+          <w:i/>
+          <w:iCs/>
+          <w:sz w:val="25"/>
+          <w:szCs w:val="25"/>
+          <w:lang w:val="en-US"/>
+        </w:rPr>
+        <w:t>RELYEAR (Must be in 2012)</w:t>
+      </w:r>
+      <w:r>
+        <w:rPr>
+          <w:rFonts w:hint="default" w:ascii="Times New Roman" w:hAnsi="Times New Roman" w:eastAsia="SimSun" w:cs="Times New Roman"/>
+          <w:b w:val="0"/>
+          <w:bCs w:val="0"/>
+          <w:i w:val="0"/>
+          <w:iCs w:val="0"/>
+          <w:sz w:val="25"/>
+          <w:szCs w:val="25"/>
+          <w:lang w:val="en-US"/>
+        </w:rPr>
+        <w:t xml:space="preserve">, </w:t>
+      </w:r>
+      <w:r>
+        <w:rPr>
+          <w:rFonts w:hint="default" w:ascii="Times New Roman" w:hAnsi="Times New Roman" w:eastAsia="SimSun" w:cs="Times New Roman"/>
+          <w:b/>
+          <w:bCs/>
+          <w:i/>
+          <w:iCs/>
+          <w:sz w:val="25"/>
+          <w:szCs w:val="25"/>
+          <w:lang w:val="en-US"/>
+        </w:rPr>
+        <w:t>RUNTIME (Descending Sort)</w:t>
+      </w:r>
+      <w:r>
+        <w:rPr>
+          <w:rFonts w:hint="default" w:ascii="Times New Roman" w:hAnsi="Times New Roman" w:eastAsia="SimSun" w:cs="Times New Roman"/>
+          <w:b w:val="0"/>
+          <w:bCs w:val="0"/>
+          <w:i w:val="0"/>
+          <w:iCs w:val="0"/>
+          <w:sz w:val="25"/>
+          <w:szCs w:val="25"/>
+          <w:lang w:val="en-US"/>
+        </w:rPr>
+        <w:t xml:space="preserve">. After finishing query, save query to named </w:t>
+      </w:r>
+      <w:r>
+        <w:rPr>
+          <w:rFonts w:hint="default" w:ascii="Times New Roman" w:hAnsi="Times New Roman" w:eastAsia="SimSun" w:cs="Times New Roman"/>
+          <w:b/>
+          <w:bCs/>
+          <w:i/>
+          <w:iCs/>
+          <w:sz w:val="25"/>
+          <w:szCs w:val="25"/>
+          <w:lang w:val="en-US"/>
+        </w:rPr>
+        <w:t>T1PB_5520.</w:t>
       </w:r>
     </w:p>
     <w:p>
@@ -3010,48 +4084,40 @@
         </w:numPr>
         <w:spacing w:line="240" w:lineRule="auto"/>
         <w:ind w:leftChars="0"/>
-        <w:jc w:val="center"/>
-        <w:rPr>
-          <w:rFonts w:hint="default" w:ascii="Times New Roman" w:hAnsi="Times New Roman" w:eastAsia="SimSun" w:cs="Times New Roman"/>
-          <w:b/>
-          <w:bCs/>
-          <w:i/>
-          <w:iCs/>
-          <w:sz w:val="21"/>
-          <w:szCs w:val="21"/>
-        </w:rPr>
-      </w:pPr>
-      <w:r>
-        <w:rPr>
-          <w:rFonts w:hint="default" w:ascii="Times New Roman" w:hAnsi="Times New Roman" w:cs="Times New Roman"/>
-          <w:b/>
-          <w:bCs/>
-          <w:i/>
-          <w:iCs/>
-          <w:sz w:val="21"/>
-          <w:szCs w:val="21"/>
-        </w:rPr>
+        <w:jc w:val="both"/>
+        <w:rPr>
+          <w:rFonts w:hint="default" w:ascii="Times New Roman" w:hAnsi="Times New Roman" w:eastAsia="SimSun" w:cs="Times New Roman"/>
+          <w:b/>
+          <w:bCs/>
+          <w:i/>
+          <w:iCs/>
+          <w:sz w:val="25"/>
+          <w:szCs w:val="25"/>
+          <w:lang w:val="en-US"/>
+        </w:rPr>
+      </w:pPr>
+      <w:r>
         <w:drawing>
-          <wp:anchor distT="0" distB="0" distL="114300" distR="114300" simplePos="0" relativeHeight="251664384" behindDoc="1" locked="0" layoutInCell="1" allowOverlap="1">
+          <wp:anchor distT="0" distB="0" distL="114300" distR="114300" simplePos="0" relativeHeight="251684864" behindDoc="1" locked="0" layoutInCell="1" allowOverlap="1">
             <wp:simplePos x="0" y="0"/>
             <wp:positionH relativeFrom="column">
-              <wp:posOffset>1905</wp:posOffset>
+              <wp:posOffset>1270</wp:posOffset>
             </wp:positionH>
             <wp:positionV relativeFrom="paragraph">
               <wp:posOffset>0</wp:posOffset>
             </wp:positionV>
-            <wp:extent cx="5270500" cy="4122420"/>
-            <wp:effectExtent l="0" t="0" r="2540" b="7620"/>
+            <wp:extent cx="5271770" cy="2599055"/>
+            <wp:effectExtent l="0" t="0" r="1270" b="6985"/>
             <wp:wrapTight wrapText="bothSides">
               <wp:wrapPolygon>
                 <wp:start x="0" y="0"/>
-                <wp:lineTo x="0" y="21560"/>
-                <wp:lineTo x="21548" y="21560"/>
-                <wp:lineTo x="21548" y="0"/>
+                <wp:lineTo x="0" y="21531"/>
+                <wp:lineTo x="21543" y="21531"/>
+                <wp:lineTo x="21543" y="0"/>
                 <wp:lineTo x="0" y="0"/>
               </wp:wrapPolygon>
             </wp:wrapTight>
-            <wp:docPr id="6" name="Picture 2"/>
+            <wp:docPr id="31" name="Picture 4"/>
             <wp:cNvGraphicFramePr>
               <a:graphicFrameLocks xmlns:a="http://schemas.openxmlformats.org/drawingml/2006/main" noChangeAspect="1"/>
             </wp:cNvGraphicFramePr>
@@ -3059,7 +4125,7 @@
               <a:graphicData uri="http://schemas.openxmlformats.org/drawingml/2006/picture">
                 <pic:pic xmlns:pic="http://schemas.openxmlformats.org/drawingml/2006/picture">
                   <pic:nvPicPr>
-                    <pic:cNvPr id="6" name="Picture 2"/>
+                    <pic:cNvPr id="31" name="Picture 4"/>
                     <pic:cNvPicPr>
                       <a:picLocks noChangeAspect="1"/>
                     </pic:cNvPicPr>
@@ -3073,7 +4139,7 @@
                   <pic:spPr>
                     <a:xfrm>
                       <a:off x="0" y="0"/>
-                      <a:ext cx="5270500" cy="4122420"/>
+                      <a:ext cx="5271770" cy="2599055"/>
                     </a:xfrm>
                     <a:prstGeom prst="rect">
                       <a:avLst/>
@@ -3089,6 +4155,26 @@
           </wp:anchor>
         </w:drawing>
       </w:r>
+    </w:p>
+    <w:p>
+      <w:pPr>
+        <w:numPr>
+          <w:ilvl w:val="0"/>
+          <w:numId w:val="0"/>
+        </w:numPr>
+        <w:spacing w:line="240" w:lineRule="auto"/>
+        <w:ind w:leftChars="0"/>
+        <w:jc w:val="center"/>
+        <w:rPr>
+          <w:rFonts w:hint="default" w:ascii="Times New Roman" w:hAnsi="Times New Roman" w:eastAsia="SimSun" w:cs="Times New Roman"/>
+          <w:b/>
+          <w:bCs/>
+          <w:i/>
+          <w:iCs/>
+          <w:sz w:val="21"/>
+          <w:szCs w:val="21"/>
+        </w:rPr>
+      </w:pPr>
       <w:r>
         <w:rPr>
           <w:rFonts w:hint="default" w:ascii="Times New Roman" w:hAnsi="Times New Roman" w:eastAsia="SimSun" w:cs="Times New Roman"/>
@@ -3132,139 +4218,22 @@
           <w:iCs/>
           <w:sz w:val="21"/>
           <w:szCs w:val="21"/>
-          <w:lang w:val="en-US"/>
-        </w:rPr>
-      </w:pPr>
-    </w:p>
-    <w:p>
-      <w:pPr>
-        <w:numPr>
-          <w:ilvl w:val="0"/>
-          <w:numId w:val="0"/>
-        </w:numPr>
-        <w:spacing w:line="240" w:lineRule="auto"/>
-        <w:ind w:leftChars="0"/>
-        <w:jc w:val="both"/>
-        <w:rPr>
-          <w:rFonts w:hint="default" w:ascii="Times New Roman" w:hAnsi="Times New Roman" w:eastAsia="SimSun" w:cs="Times New Roman"/>
-          <w:b/>
-          <w:bCs/>
-          <w:i/>
-          <w:iCs/>
-          <w:sz w:val="21"/>
-          <w:szCs w:val="21"/>
-          <w:lang w:val="en-US"/>
-        </w:rPr>
-      </w:pPr>
-    </w:p>
-    <w:p>
-      <w:pPr>
-        <w:numPr>
-          <w:ilvl w:val="0"/>
-          <w:numId w:val="0"/>
-        </w:numPr>
-        <w:spacing w:line="240" w:lineRule="auto"/>
-        <w:ind w:leftChars="0"/>
-        <w:jc w:val="both"/>
-        <w:rPr>
-          <w:rFonts w:hint="default" w:ascii="Times New Roman" w:hAnsi="Times New Roman" w:eastAsia="SimSun" w:cs="Times New Roman"/>
-          <w:b/>
-          <w:bCs/>
-          <w:i/>
-          <w:iCs/>
-          <w:sz w:val="21"/>
-          <w:szCs w:val="21"/>
-          <w:lang w:val="en-US"/>
-        </w:rPr>
-      </w:pPr>
-    </w:p>
-    <w:p>
-      <w:pPr>
-        <w:numPr>
-          <w:ilvl w:val="0"/>
-          <w:numId w:val="0"/>
-        </w:numPr>
-        <w:spacing w:line="240" w:lineRule="auto"/>
-        <w:ind w:leftChars="0"/>
-        <w:jc w:val="both"/>
-        <w:rPr>
-          <w:rFonts w:hint="default" w:ascii="Times New Roman" w:hAnsi="Times New Roman" w:eastAsia="SimSun" w:cs="Times New Roman"/>
-          <w:b/>
-          <w:bCs/>
-          <w:i/>
-          <w:iCs/>
-          <w:sz w:val="21"/>
-          <w:szCs w:val="21"/>
-          <w:lang w:val="en-US"/>
-        </w:rPr>
-      </w:pPr>
-    </w:p>
-    <w:p>
-      <w:pPr>
-        <w:numPr>
-          <w:ilvl w:val="0"/>
-          <w:numId w:val="0"/>
-        </w:numPr>
-        <w:pBdr>
-          <w:bottom w:val="single" w:color="auto" w:sz="4" w:space="0"/>
-        </w:pBdr>
-        <w:spacing w:line="240" w:lineRule="auto"/>
-        <w:ind w:leftChars="0"/>
-        <w:jc w:val="center"/>
-        <w:rPr>
-          <w:rFonts w:hint="default" w:ascii="Times New Roman" w:hAnsi="Times New Roman" w:eastAsia="SimSun" w:cs="Times New Roman"/>
-          <w:b/>
-          <w:bCs/>
-          <w:i/>
-          <w:iCs/>
-          <w:sz w:val="21"/>
-          <w:szCs w:val="21"/>
-        </w:rPr>
-      </w:pPr>
-      <w:r>
-        <w:rPr>
-          <w:rFonts w:hint="default" w:ascii="Times New Roman" w:hAnsi="Times New Roman" w:eastAsia="SimSun" w:cs="Times New Roman"/>
-          <w:b/>
-          <w:bCs/>
-          <w:i/>
-          <w:iCs/>
-          <w:sz w:val="21"/>
-          <w:szCs w:val="21"/>
-          <w:lang w:val="en-US"/>
-        </w:rPr>
-        <w:br w:type="textWrapping"/>
-      </w:r>
-      <w:r>
-        <w:rPr>
-          <w:rFonts w:hint="default" w:ascii="Times New Roman" w:hAnsi="Times New Roman" w:cs="Times New Roman"/>
-          <w:b/>
-          <w:bCs/>
-          <w:i/>
-          <w:iCs/>
-          <w:sz w:val="21"/>
-          <w:szCs w:val="21"/>
-        </w:rPr>
+        </w:rPr>
+      </w:pPr>
+      <w:r>
         <w:drawing>
-          <wp:anchor distT="0" distB="0" distL="114300" distR="114300" simplePos="0" relativeHeight="251665408" behindDoc="1" locked="0" layoutInCell="1" allowOverlap="1">
+          <wp:anchor distT="0" distB="0" distL="114300" distR="114300" simplePos="0" relativeHeight="251683840" behindDoc="0" locked="0" layoutInCell="1" allowOverlap="1">
             <wp:simplePos x="0" y="0"/>
             <wp:positionH relativeFrom="column">
-              <wp:posOffset>0</wp:posOffset>
+              <wp:posOffset>1905</wp:posOffset>
             </wp:positionH>
             <wp:positionV relativeFrom="paragraph">
-              <wp:posOffset>213360</wp:posOffset>
+              <wp:posOffset>0</wp:posOffset>
             </wp:positionV>
-            <wp:extent cx="5273675" cy="3689350"/>
-            <wp:effectExtent l="0" t="0" r="14605" b="13970"/>
-            <wp:wrapTight wrapText="bothSides">
-              <wp:wrapPolygon>
-                <wp:start x="0" y="0"/>
-                <wp:lineTo x="0" y="21503"/>
-                <wp:lineTo x="21535" y="21503"/>
-                <wp:lineTo x="21535" y="0"/>
-                <wp:lineTo x="0" y="0"/>
-              </wp:wrapPolygon>
-            </wp:wrapTight>
-            <wp:docPr id="7" name="Picture 3"/>
+            <wp:extent cx="5270500" cy="943610"/>
+            <wp:effectExtent l="0" t="0" r="2540" b="1270"/>
+            <wp:wrapSquare wrapText="bothSides"/>
+            <wp:docPr id="30" name="Picture 3"/>
             <wp:cNvGraphicFramePr>
               <a:graphicFrameLocks xmlns:a="http://schemas.openxmlformats.org/drawingml/2006/main" noChangeAspect="1"/>
             </wp:cNvGraphicFramePr>
@@ -3272,7 +4241,7 @@
               <a:graphicData uri="http://schemas.openxmlformats.org/drawingml/2006/picture">
                 <pic:pic xmlns:pic="http://schemas.openxmlformats.org/drawingml/2006/picture">
                   <pic:nvPicPr>
-                    <pic:cNvPr id="7" name="Picture 3"/>
+                    <pic:cNvPr id="30" name="Picture 3"/>
                     <pic:cNvPicPr>
                       <a:picLocks noChangeAspect="1"/>
                     </pic:cNvPicPr>
@@ -3286,7 +4255,7 @@
                   <pic:spPr>
                     <a:xfrm>
                       <a:off x="0" y="0"/>
-                      <a:ext cx="5273675" cy="3689350"/>
+                      <a:ext cx="5270500" cy="943610"/>
                     </a:xfrm>
                     <a:prstGeom prst="rect">
                       <a:avLst/>
@@ -3313,6 +4282,19 @@
           <w:szCs w:val="21"/>
           <w:lang w:val="en-US"/>
         </w:rPr>
+        <w:br w:type="textWrapping"/>
+      </w:r>
+      <w:r>
+        <w:rPr>
+          <w:rFonts w:hint="default" w:ascii="Times New Roman" w:hAnsi="Times New Roman" w:eastAsia="SimSun" w:cs="Times New Roman"/>
+          <w:b/>
+          <w:bCs/>
+          <w:i/>
+          <w:iCs/>
+          <w:sz w:val="21"/>
+          <w:szCs w:val="21"/>
+          <w:lang w:val="en-US"/>
+        </w:rPr>
         <w:t xml:space="preserve">Figure 7: </w:t>
       </w:r>
       <w:r>
@@ -3457,6 +4439,7 @@
           <w:iCs/>
           <w:sz w:val="21"/>
           <w:szCs w:val="21"/>
+          <w:lang w:val="en-US"/>
         </w:rPr>
       </w:pPr>
       <w:r>
@@ -3470,7 +4453,7 @@
           <w:szCs w:val="21"/>
         </w:rPr>
         <w:drawing>
-          <wp:anchor distT="0" distB="0" distL="114300" distR="114300" simplePos="0" relativeHeight="251666432" behindDoc="1" locked="0" layoutInCell="1" allowOverlap="1">
+          <wp:anchor distT="0" distB="0" distL="114300" distR="114300" simplePos="0" relativeHeight="251662336" behindDoc="1" locked="0" layoutInCell="1" allowOverlap="1">
             <wp:simplePos x="0" y="0"/>
             <wp:positionH relativeFrom="column">
               <wp:posOffset>1905</wp:posOffset>
@@ -3559,129 +4542,6 @@
           <w:ilvl w:val="0"/>
           <w:numId w:val="0"/>
         </w:numPr>
-        <w:spacing w:line="240" w:lineRule="auto"/>
-        <w:ind w:leftChars="0"/>
-        <w:jc w:val="both"/>
-        <w:rPr>
-          <w:rFonts w:hint="default" w:ascii="Times New Roman" w:hAnsi="Times New Roman" w:eastAsia="SimSun" w:cs="Times New Roman"/>
-          <w:b/>
-          <w:bCs/>
-          <w:i/>
-          <w:iCs/>
-          <w:sz w:val="21"/>
-          <w:szCs w:val="21"/>
-          <w:lang w:val="en-US"/>
-        </w:rPr>
-      </w:pPr>
-    </w:p>
-    <w:p>
-      <w:pPr>
-        <w:numPr>
-          <w:ilvl w:val="0"/>
-          <w:numId w:val="0"/>
-        </w:numPr>
-        <w:spacing w:line="240" w:lineRule="auto"/>
-        <w:ind w:leftChars="0"/>
-        <w:jc w:val="both"/>
-        <w:rPr>
-          <w:rFonts w:hint="default" w:ascii="Times New Roman" w:hAnsi="Times New Roman" w:eastAsia="SimSun" w:cs="Times New Roman"/>
-          <w:b/>
-          <w:bCs/>
-          <w:i/>
-          <w:iCs/>
-          <w:sz w:val="21"/>
-          <w:szCs w:val="21"/>
-          <w:lang w:val="en-US"/>
-        </w:rPr>
-      </w:pPr>
-    </w:p>
-    <w:p>
-      <w:pPr>
-        <w:numPr>
-          <w:ilvl w:val="0"/>
-          <w:numId w:val="0"/>
-        </w:numPr>
-        <w:spacing w:line="240" w:lineRule="auto"/>
-        <w:ind w:leftChars="0"/>
-        <w:jc w:val="both"/>
-        <w:rPr>
-          <w:rFonts w:hint="default" w:ascii="Times New Roman" w:hAnsi="Times New Roman" w:eastAsia="SimSun" w:cs="Times New Roman"/>
-          <w:b/>
-          <w:bCs/>
-          <w:i/>
-          <w:iCs/>
-          <w:sz w:val="21"/>
-          <w:szCs w:val="21"/>
-          <w:lang w:val="en-US"/>
-        </w:rPr>
-      </w:pPr>
-      <w:r>
-        <w:rPr>
-          <w:rFonts w:hint="default" w:ascii="Times New Roman" w:hAnsi="Times New Roman" w:eastAsia="SimSun" w:cs="Times New Roman"/>
-          <w:b/>
-          <w:bCs/>
-          <w:i/>
-          <w:iCs/>
-          <w:sz w:val="21"/>
-          <w:szCs w:val="21"/>
-          <w:lang w:val="en-US"/>
-        </w:rPr>
-        <w:br w:type="textWrapping"/>
-      </w:r>
-      <w:r>
-        <w:rPr>
-          <w:rFonts w:hint="default" w:ascii="Times New Roman" w:hAnsi="Times New Roman" w:eastAsia="SimSun" w:cs="Times New Roman"/>
-          <w:b/>
-          <w:bCs/>
-          <w:i/>
-          <w:iCs/>
-          <w:sz w:val="21"/>
-          <w:szCs w:val="21"/>
-          <w:lang w:val="en-US"/>
-        </w:rPr>
-        <w:br w:type="textWrapping"/>
-      </w:r>
-      <w:r>
-        <w:rPr>
-          <w:rFonts w:hint="default" w:ascii="Times New Roman" w:hAnsi="Times New Roman" w:eastAsia="SimSun" w:cs="Times New Roman"/>
-          <w:b/>
-          <w:bCs/>
-          <w:i/>
-          <w:iCs/>
-          <w:sz w:val="21"/>
-          <w:szCs w:val="21"/>
-          <w:lang w:val="en-US"/>
-        </w:rPr>
-        <w:br w:type="textWrapping"/>
-      </w:r>
-    </w:p>
-    <w:p>
-      <w:pPr>
-        <w:numPr>
-          <w:ilvl w:val="0"/>
-          <w:numId w:val="0"/>
-        </w:numPr>
-        <w:spacing w:line="240" w:lineRule="auto"/>
-        <w:ind w:leftChars="0"/>
-        <w:jc w:val="both"/>
-        <w:rPr>
-          <w:rFonts w:hint="default" w:ascii="Times New Roman" w:hAnsi="Times New Roman" w:eastAsia="SimSun" w:cs="Times New Roman"/>
-          <w:b/>
-          <w:bCs/>
-          <w:i/>
-          <w:iCs/>
-          <w:sz w:val="21"/>
-          <w:szCs w:val="21"/>
-          <w:lang w:val="en-US"/>
-        </w:rPr>
-      </w:pPr>
-    </w:p>
-    <w:p>
-      <w:pPr>
-        <w:numPr>
-          <w:ilvl w:val="0"/>
-          <w:numId w:val="0"/>
-        </w:numPr>
         <w:pBdr>
           <w:bottom w:val="single" w:color="auto" w:sz="4" w:space="0"/>
         </w:pBdr>
@@ -3700,7 +4560,7 @@
       </w:pPr>
       <w:r>
         <w:drawing>
-          <wp:anchor distT="0" distB="0" distL="114300" distR="114300" simplePos="0" relativeHeight="251667456" behindDoc="0" locked="0" layoutInCell="1" allowOverlap="1">
+          <wp:anchor distT="0" distB="0" distL="114300" distR="114300" simplePos="0" relativeHeight="251663360" behindDoc="0" locked="0" layoutInCell="1" allowOverlap="1">
             <wp:simplePos x="0" y="0"/>
             <wp:positionH relativeFrom="column">
               <wp:posOffset>66675</wp:posOffset>
@@ -4033,7 +4893,7 @@
           <w:szCs w:val="21"/>
         </w:rPr>
         <w:drawing>
-          <wp:anchor distT="0" distB="0" distL="114300" distR="114300" simplePos="0" relativeHeight="251668480" behindDoc="0" locked="0" layoutInCell="1" allowOverlap="1">
+          <wp:anchor distT="0" distB="0" distL="114300" distR="114300" simplePos="0" relativeHeight="251664384" behindDoc="0" locked="0" layoutInCell="1" allowOverlap="1">
             <wp:simplePos x="0" y="0"/>
             <wp:positionH relativeFrom="column">
               <wp:posOffset>4445</wp:posOffset>
@@ -4129,7 +4989,7 @@
       </w:pPr>
       <w:r>
         <w:drawing>
-          <wp:anchor distT="0" distB="0" distL="114300" distR="114300" simplePos="0" relativeHeight="251669504" behindDoc="0" locked="0" layoutInCell="1" allowOverlap="1">
+          <wp:anchor distT="0" distB="0" distL="114300" distR="114300" simplePos="0" relativeHeight="251665408" behindDoc="0" locked="0" layoutInCell="1" allowOverlap="1">
             <wp:simplePos x="0" y="0"/>
             <wp:positionH relativeFrom="column">
               <wp:posOffset>3175</wp:posOffset>
@@ -4245,69 +5105,6 @@
           <w:iCs/>
           <w:sz w:val="21"/>
           <w:szCs w:val="21"/>
-        </w:rPr>
-      </w:pPr>
-    </w:p>
-    <w:p>
-      <w:pPr>
-        <w:numPr>
-          <w:ilvl w:val="0"/>
-          <w:numId w:val="0"/>
-        </w:numPr>
-        <w:spacing w:line="240" w:lineRule="auto"/>
-        <w:ind w:leftChars="0"/>
-        <w:jc w:val="both"/>
-        <w:rPr>
-          <w:rFonts w:hint="default" w:ascii="Times New Roman" w:hAnsi="Times New Roman" w:eastAsia="SimSun" w:cs="Times New Roman"/>
-          <w:b/>
-          <w:bCs/>
-          <w:i/>
-          <w:iCs/>
-          <w:sz w:val="21"/>
-          <w:szCs w:val="21"/>
-          <w:lang w:val="en-US"/>
-        </w:rPr>
-      </w:pPr>
-    </w:p>
-    <w:p>
-      <w:pPr>
-        <w:numPr>
-          <w:ilvl w:val="0"/>
-          <w:numId w:val="0"/>
-        </w:numPr>
-        <w:spacing w:line="240" w:lineRule="auto"/>
-        <w:ind w:leftChars="0"/>
-        <w:jc w:val="both"/>
-        <w:rPr>
-          <w:rFonts w:hint="default" w:ascii="Times New Roman" w:hAnsi="Times New Roman" w:eastAsia="SimSun" w:cs="Times New Roman"/>
-          <w:b/>
-          <w:bCs/>
-          <w:i/>
-          <w:iCs/>
-          <w:sz w:val="21"/>
-          <w:szCs w:val="21"/>
-          <w:lang w:val="en-US"/>
-        </w:rPr>
-      </w:pPr>
-    </w:p>
-    <w:p>
-      <w:pPr>
-        <w:numPr>
-          <w:ilvl w:val="0"/>
-          <w:numId w:val="0"/>
-        </w:numPr>
-        <w:spacing w:line="240" w:lineRule="auto"/>
-        <w:ind w:leftChars="0"/>
-        <w:jc w:val="both"/>
-        <w:rPr>
-          <w:rFonts w:hint="default" w:ascii="Times New Roman" w:hAnsi="Times New Roman" w:eastAsia="SimSun" w:cs="Times New Roman"/>
-          <w:b/>
-          <w:bCs/>
-          <w:i/>
-          <w:iCs/>
-          <w:sz w:val="21"/>
-          <w:szCs w:val="21"/>
-          <w:lang w:val="en-US"/>
         </w:rPr>
       </w:pPr>
     </w:p>
@@ -5133,7 +5930,7 @@
           <w:szCs w:val="21"/>
         </w:rPr>
         <w:drawing>
-          <wp:anchor distT="0" distB="0" distL="114300" distR="114300" simplePos="0" relativeHeight="251670528" behindDoc="0" locked="0" layoutInCell="1" allowOverlap="1">
+          <wp:anchor distT="0" distB="0" distL="114300" distR="114300" simplePos="0" relativeHeight="251666432" behindDoc="0" locked="0" layoutInCell="1" allowOverlap="1">
             <wp:simplePos x="0" y="0"/>
             <wp:positionH relativeFrom="column">
               <wp:posOffset>854075</wp:posOffset>
@@ -5229,7 +6026,7 @@
           <w:szCs w:val="21"/>
         </w:rPr>
         <w:drawing>
-          <wp:anchor distT="0" distB="0" distL="114300" distR="114300" simplePos="0" relativeHeight="251671552" behindDoc="0" locked="0" layoutInCell="1" allowOverlap="1">
+          <wp:anchor distT="0" distB="0" distL="114300" distR="114300" simplePos="0" relativeHeight="251667456" behindDoc="0" locked="0" layoutInCell="1" allowOverlap="1">
             <wp:simplePos x="0" y="0"/>
             <wp:positionH relativeFrom="column">
               <wp:posOffset>236855</wp:posOffset>
@@ -5551,60 +6348,9 @@
           <w:lang w:val="en-US"/>
         </w:rPr>
       </w:pPr>
-    </w:p>
-    <w:p>
-      <w:pPr>
-        <w:spacing w:line="240" w:lineRule="auto"/>
-        <w:ind w:left="0" w:leftChars="0" w:firstLine="0" w:firstLineChars="0"/>
-        <w:jc w:val="both"/>
-        <w:rPr>
-          <w:rFonts w:hint="default" w:ascii="Times New Roman" w:hAnsi="Times New Roman" w:cs="Times New Roman"/>
-          <w:b w:val="0"/>
-          <w:bCs w:val="0"/>
-          <w:i w:val="0"/>
-          <w:iCs w:val="0"/>
-          <w:sz w:val="25"/>
-          <w:szCs w:val="25"/>
-          <w:lang w:val="en-US"/>
-        </w:rPr>
-      </w:pPr>
-    </w:p>
-    <w:p>
-      <w:pPr>
-        <w:spacing w:line="240" w:lineRule="auto"/>
-        <w:ind w:left="0" w:leftChars="0" w:firstLine="0" w:firstLineChars="0"/>
-        <w:jc w:val="both"/>
-        <w:rPr>
-          <w:rFonts w:hint="default" w:ascii="Times New Roman" w:hAnsi="Times New Roman" w:cs="Times New Roman"/>
-          <w:b w:val="0"/>
-          <w:bCs w:val="0"/>
-          <w:i w:val="0"/>
-          <w:iCs w:val="0"/>
-          <w:sz w:val="25"/>
-          <w:szCs w:val="25"/>
-          <w:lang w:val="en-US"/>
-        </w:rPr>
-      </w:pPr>
-    </w:p>
-    <w:p>
-      <w:pPr>
-        <w:spacing w:line="240" w:lineRule="auto"/>
-        <w:ind w:left="0" w:leftChars="0" w:firstLine="0" w:firstLineChars="0"/>
-        <w:jc w:val="both"/>
-        <w:rPr>
-          <w:rFonts w:hint="default" w:ascii="Times New Roman" w:hAnsi="Times New Roman" w:cs="Times New Roman"/>
-          <w:b w:val="0"/>
-          <w:bCs w:val="0"/>
-          <w:i w:val="0"/>
-          <w:iCs w:val="0"/>
-          <w:sz w:val="25"/>
-          <w:szCs w:val="25"/>
-          <w:lang w:val="en-US"/>
-        </w:rPr>
-      </w:pPr>
       <w:r>
         <w:drawing>
-          <wp:anchor distT="0" distB="0" distL="114300" distR="114300" simplePos="0" relativeHeight="251672576" behindDoc="1" locked="0" layoutInCell="1" allowOverlap="1">
+          <wp:anchor distT="0" distB="0" distL="114300" distR="114300" simplePos="0" relativeHeight="251668480" behindDoc="1" locked="0" layoutInCell="1" allowOverlap="1">
             <wp:simplePos x="0" y="0"/>
             <wp:positionH relativeFrom="column">
               <wp:posOffset>1056005</wp:posOffset>
@@ -5931,7 +6677,7 @@
           <w:szCs w:val="21"/>
         </w:rPr>
         <w:drawing>
-          <wp:anchor distT="0" distB="0" distL="114300" distR="114300" simplePos="0" relativeHeight="251673600" behindDoc="1" locked="0" layoutInCell="1" allowOverlap="1">
+          <wp:anchor distT="0" distB="0" distL="114300" distR="114300" simplePos="0" relativeHeight="251669504" behindDoc="1" locked="0" layoutInCell="1" allowOverlap="1">
             <wp:simplePos x="0" y="0"/>
             <wp:positionH relativeFrom="column">
               <wp:posOffset>4445</wp:posOffset>
@@ -6364,75 +7110,15 @@
           <w:lang w:val="en-US"/>
         </w:rPr>
       </w:pPr>
-    </w:p>
-    <w:p>
-      <w:pPr>
-        <w:ind w:left="0" w:leftChars="0" w:firstLine="0" w:firstLineChars="0"/>
-        <w:jc w:val="both"/>
-        <w:rPr>
-          <w:rFonts w:hint="default" w:ascii="Times New Roman" w:hAnsi="Times New Roman" w:cs="Times New Roman"/>
-          <w:i w:val="0"/>
-          <w:iCs w:val="0"/>
-          <w:color w:val="auto"/>
-          <w:sz w:val="25"/>
-          <w:szCs w:val="25"/>
-          <w:lang w:val="en-US"/>
-        </w:rPr>
-      </w:pPr>
-    </w:p>
-    <w:p>
-      <w:pPr>
-        <w:ind w:left="0" w:leftChars="0" w:firstLine="0" w:firstLineChars="0"/>
-        <w:jc w:val="both"/>
-        <w:rPr>
-          <w:rFonts w:hint="default" w:ascii="Times New Roman" w:hAnsi="Times New Roman" w:cs="Times New Roman"/>
-          <w:i w:val="0"/>
-          <w:iCs w:val="0"/>
-          <w:color w:val="auto"/>
-          <w:sz w:val="25"/>
-          <w:szCs w:val="25"/>
-          <w:lang w:val="en-US"/>
-        </w:rPr>
-      </w:pPr>
-    </w:p>
-    <w:p>
-      <w:pPr>
-        <w:ind w:left="0" w:leftChars="0" w:firstLine="0" w:firstLineChars="0"/>
-        <w:jc w:val="both"/>
-        <w:rPr>
-          <w:rFonts w:hint="default" w:ascii="Times New Roman" w:hAnsi="Times New Roman" w:cs="Times New Roman"/>
-          <w:i w:val="0"/>
-          <w:iCs w:val="0"/>
-          <w:color w:val="auto"/>
-          <w:sz w:val="25"/>
-          <w:szCs w:val="25"/>
-          <w:lang w:val="en-US"/>
-        </w:rPr>
-      </w:pPr>
-    </w:p>
-    <w:p>
-      <w:pPr>
-        <w:ind w:left="0" w:leftChars="0" w:firstLine="0" w:firstLineChars="0"/>
-        <w:jc w:val="both"/>
-        <w:rPr>
-          <w:rFonts w:hint="default" w:ascii="Times New Roman" w:hAnsi="Times New Roman" w:cs="Times New Roman"/>
-          <w:i w:val="0"/>
-          <w:iCs w:val="0"/>
-          <w:color w:val="auto"/>
-          <w:sz w:val="25"/>
-          <w:szCs w:val="25"/>
-          <w:lang w:val="en-US"/>
-        </w:rPr>
-      </w:pPr>
       <w:r>
         <w:drawing>
-          <wp:anchor distT="0" distB="0" distL="114300" distR="114300" simplePos="0" relativeHeight="251674624" behindDoc="0" locked="0" layoutInCell="1" allowOverlap="1">
+          <wp:anchor distT="0" distB="0" distL="114300" distR="114300" simplePos="0" relativeHeight="251670528" behindDoc="0" locked="0" layoutInCell="1" allowOverlap="1">
             <wp:simplePos x="0" y="0"/>
             <wp:positionH relativeFrom="column">
-              <wp:posOffset>1905</wp:posOffset>
+              <wp:posOffset>1270</wp:posOffset>
             </wp:positionH>
             <wp:positionV relativeFrom="paragraph">
-              <wp:posOffset>76200</wp:posOffset>
+              <wp:posOffset>131445</wp:posOffset>
             </wp:positionV>
             <wp:extent cx="5271135" cy="2971800"/>
             <wp:effectExtent l="0" t="0" r="1905" b="0"/>
@@ -6540,6 +7226,86 @@
           <w:szCs w:val="21"/>
         </w:rPr>
       </w:pPr>
+    </w:p>
+    <w:p>
+      <w:pPr>
+        <w:numPr>
+          <w:ilvl w:val="0"/>
+          <w:numId w:val="0"/>
+        </w:numPr>
+        <w:spacing w:line="240" w:lineRule="auto"/>
+        <w:ind w:leftChars="0"/>
+        <w:jc w:val="center"/>
+        <w:rPr>
+          <w:rFonts w:hint="default" w:ascii="Times New Roman" w:hAnsi="Times New Roman" w:eastAsia="SimSun" w:cs="Times New Roman"/>
+          <w:b/>
+          <w:bCs/>
+          <w:i/>
+          <w:iCs/>
+          <w:sz w:val="21"/>
+          <w:szCs w:val="21"/>
+        </w:rPr>
+      </w:pPr>
+    </w:p>
+    <w:p>
+      <w:pPr>
+        <w:numPr>
+          <w:ilvl w:val="0"/>
+          <w:numId w:val="0"/>
+        </w:numPr>
+        <w:spacing w:line="240" w:lineRule="auto"/>
+        <w:ind w:leftChars="0"/>
+        <w:jc w:val="center"/>
+        <w:rPr>
+          <w:rFonts w:hint="default" w:ascii="Times New Roman" w:hAnsi="Times New Roman" w:eastAsia="SimSun" w:cs="Times New Roman"/>
+          <w:b/>
+          <w:bCs/>
+          <w:i/>
+          <w:iCs/>
+          <w:sz w:val="21"/>
+          <w:szCs w:val="21"/>
+        </w:rPr>
+      </w:pPr>
+    </w:p>
+    <w:p>
+      <w:pPr>
+        <w:numPr>
+          <w:ilvl w:val="0"/>
+          <w:numId w:val="0"/>
+        </w:numPr>
+        <w:spacing w:line="240" w:lineRule="auto"/>
+        <w:ind w:leftChars="0"/>
+        <w:jc w:val="center"/>
+        <w:rPr>
+          <w:rFonts w:hint="default" w:ascii="Times New Roman" w:hAnsi="Times New Roman" w:eastAsia="SimSun" w:cs="Times New Roman"/>
+          <w:b/>
+          <w:bCs/>
+          <w:i/>
+          <w:iCs/>
+          <w:sz w:val="21"/>
+          <w:szCs w:val="21"/>
+        </w:rPr>
+      </w:pPr>
+    </w:p>
+    <w:p>
+      <w:pPr>
+        <w:numPr>
+          <w:ilvl w:val="0"/>
+          <w:numId w:val="0"/>
+        </w:numPr>
+        <w:spacing w:line="240" w:lineRule="auto"/>
+        <w:ind w:leftChars="0"/>
+        <w:jc w:val="center"/>
+        <w:rPr>
+          <w:rFonts w:hint="default" w:ascii="Times New Roman" w:hAnsi="Times New Roman" w:eastAsia="SimSun" w:cs="Times New Roman"/>
+          <w:b/>
+          <w:bCs/>
+          <w:i/>
+          <w:iCs/>
+          <w:sz w:val="21"/>
+          <w:szCs w:val="21"/>
+        </w:rPr>
+      </w:pPr>
       <w:r>
         <w:rPr>
           <w:rFonts w:hint="default" w:ascii="Times New Roman" w:hAnsi="Times New Roman" w:cs="Times New Roman"/>
@@ -6551,7 +7317,7 @@
           <w:szCs w:val="21"/>
         </w:rPr>
         <w:drawing>
-          <wp:anchor distT="0" distB="0" distL="114300" distR="114300" simplePos="0" relativeHeight="251675648" behindDoc="1" locked="0" layoutInCell="1" allowOverlap="1">
+          <wp:anchor distT="0" distB="0" distL="114300" distR="114300" simplePos="0" relativeHeight="251671552" behindDoc="1" locked="0" layoutInCell="1" allowOverlap="1">
             <wp:simplePos x="0" y="0"/>
             <wp:positionH relativeFrom="column">
               <wp:posOffset>1905</wp:posOffset>
@@ -6850,7 +7616,7 @@
           <w:szCs w:val="21"/>
         </w:rPr>
         <w:drawing>
-          <wp:anchor distT="0" distB="0" distL="114300" distR="114300" simplePos="0" relativeHeight="251676672" behindDoc="0" locked="0" layoutInCell="1" allowOverlap="1">
+          <wp:anchor distT="0" distB="0" distL="114300" distR="114300" simplePos="0" relativeHeight="251672576" behindDoc="0" locked="0" layoutInCell="1" allowOverlap="1">
             <wp:simplePos x="0" y="0"/>
             <wp:positionH relativeFrom="column">
               <wp:posOffset>777875</wp:posOffset>
@@ -6986,6 +7752,7 @@
           <w:iCs/>
           <w:sz w:val="21"/>
           <w:szCs w:val="21"/>
+          <w:lang w:val="en-US"/>
         </w:rPr>
       </w:pPr>
       <w:r>
@@ -7261,42 +8028,29 @@
         </w:rPr>
         <w:br w:type="textWrapping"/>
       </w:r>
-      <w:r>
-        <w:rPr>
-          <w:rFonts w:hint="default" w:ascii="Times New Roman" w:hAnsi="Times New Roman" w:eastAsia="SimSun" w:cs="Times New Roman"/>
-          <w:b/>
-          <w:bCs/>
-          <w:i/>
-          <w:iCs/>
-          <w:sz w:val="21"/>
-          <w:szCs w:val="21"/>
-          <w:lang w:val="en-US"/>
-        </w:rPr>
-        <w:br w:type="textWrapping"/>
-      </w:r>
-      <w:r>
-        <w:rPr>
-          <w:rFonts w:hint="default" w:ascii="Times New Roman" w:hAnsi="Times New Roman" w:cs="Times New Roman"/>
-          <w:b/>
-          <w:bCs/>
-          <w:i/>
-          <w:iCs/>
-          <w:sz w:val="21"/>
-          <w:szCs w:val="21"/>
-        </w:rPr>
+      <w:bookmarkStart w:id="0" w:name="_GoBack"/>
+      <w:r>
         <w:drawing>
-          <wp:anchor distT="0" distB="0" distL="114300" distR="114300" simplePos="0" relativeHeight="251677696" behindDoc="0" locked="0" layoutInCell="1" allowOverlap="1">
+          <wp:anchor distT="0" distB="0" distL="114300" distR="114300" simplePos="0" relativeHeight="251685888" behindDoc="1" locked="0" layoutInCell="1" allowOverlap="1">
             <wp:simplePos x="0" y="0"/>
             <wp:positionH relativeFrom="column">
-              <wp:posOffset>842645</wp:posOffset>
+              <wp:posOffset>960755</wp:posOffset>
             </wp:positionH>
             <wp:positionV relativeFrom="paragraph">
-              <wp:posOffset>121920</wp:posOffset>
+              <wp:posOffset>160020</wp:posOffset>
             </wp:positionV>
-            <wp:extent cx="3589020" cy="3147060"/>
-            <wp:effectExtent l="0" t="0" r="7620" b="7620"/>
-            <wp:wrapSquare wrapText="bothSides"/>
-            <wp:docPr id="19" name="Picture 2"/>
+            <wp:extent cx="3352800" cy="2956560"/>
+            <wp:effectExtent l="0" t="0" r="0" b="0"/>
+            <wp:wrapTight wrapText="bothSides">
+              <wp:wrapPolygon>
+                <wp:start x="0" y="0"/>
+                <wp:lineTo x="0" y="21489"/>
+                <wp:lineTo x="21502" y="21489"/>
+                <wp:lineTo x="21502" y="0"/>
+                <wp:lineTo x="0" y="0"/>
+              </wp:wrapPolygon>
+            </wp:wrapTight>
+            <wp:docPr id="32" name="Picture 5"/>
             <wp:cNvGraphicFramePr>
               <a:graphicFrameLocks xmlns:a="http://schemas.openxmlformats.org/drawingml/2006/main" noChangeAspect="1"/>
             </wp:cNvGraphicFramePr>
@@ -7304,7 +8058,7 @@
               <a:graphicData uri="http://schemas.openxmlformats.org/drawingml/2006/picture">
                 <pic:pic xmlns:pic="http://schemas.openxmlformats.org/drawingml/2006/picture">
                   <pic:nvPicPr>
-                    <pic:cNvPr id="19" name="Picture 2"/>
+                    <pic:cNvPr id="32" name="Picture 5"/>
                     <pic:cNvPicPr>
                       <a:picLocks noChangeAspect="1"/>
                     </pic:cNvPicPr>
@@ -7318,7 +8072,7 @@
                   <pic:spPr>
                     <a:xfrm>
                       <a:off x="0" y="0"/>
-                      <a:ext cx="3589020" cy="3147060"/>
+                      <a:ext cx="3352800" cy="2956560"/>
                     </a:xfrm>
                     <a:prstGeom prst="rect">
                       <a:avLst/>
@@ -7334,30 +8088,19 @@
           </wp:anchor>
         </w:drawing>
       </w:r>
-      <w:r>
-        <w:rPr>
-          <w:rFonts w:hint="default" w:ascii="Times New Roman" w:hAnsi="Times New Roman" w:cs="Times New Roman"/>
-          <w:b/>
-          <w:bCs/>
-          <w:i/>
-          <w:iCs/>
-          <w:sz w:val="21"/>
-          <w:szCs w:val="21"/>
-          <w:lang w:val="en-US"/>
-        </w:rPr>
-        <w:t xml:space="preserve">Figure 19: </w:t>
-      </w:r>
-      <w:r>
-        <w:rPr>
-          <w:rFonts w:hint="default" w:ascii="Times New Roman" w:hAnsi="Times New Roman" w:eastAsia="SimSun" w:cs="Times New Roman"/>
-          <w:b/>
-          <w:bCs/>
-          <w:i/>
-          <w:iCs/>
-          <w:sz w:val="21"/>
-          <w:szCs w:val="21"/>
-        </w:rPr>
-        <w:t>Query Result Showing Actor Movie Counts (Pass 1h)</w:t>
+      <w:bookmarkEnd w:id="0"/>
+      <w:r>
+        <w:rPr>
+          <w:rFonts w:hint="default" w:ascii="Times New Roman" w:hAnsi="Times New Roman" w:eastAsia="SimSun" w:cs="Times New Roman"/>
+          <w:b/>
+          <w:bCs/>
+          <w:i/>
+          <w:iCs/>
+          <w:sz w:val="21"/>
+          <w:szCs w:val="21"/>
+          <w:lang w:val="en-US"/>
+        </w:rPr>
+        <w:br w:type="textWrapping"/>
       </w:r>
     </w:p>
     <w:p>
@@ -7380,6 +8123,342 @@
           <w:iCs/>
           <w:sz w:val="21"/>
           <w:szCs w:val="21"/>
+          <w:lang w:val="en-US"/>
+        </w:rPr>
+      </w:pPr>
+    </w:p>
+    <w:p>
+      <w:pPr>
+        <w:numPr>
+          <w:ilvl w:val="0"/>
+          <w:numId w:val="0"/>
+        </w:numPr>
+        <w:pBdr>
+          <w:bottom w:val="single" w:color="auto" w:sz="4" w:space="0"/>
+        </w:pBdr>
+        <w:spacing w:line="240" w:lineRule="auto"/>
+        <w:ind w:leftChars="0"/>
+        <w:jc w:val="center"/>
+        <w:rPr>
+          <w:rFonts w:hint="default" w:ascii="Times New Roman" w:hAnsi="Times New Roman" w:eastAsia="SimSun" w:cs="Times New Roman"/>
+          <w:b/>
+          <w:bCs/>
+          <w:i/>
+          <w:iCs/>
+          <w:sz w:val="21"/>
+          <w:szCs w:val="21"/>
+          <w:lang w:val="en-US"/>
+        </w:rPr>
+      </w:pPr>
+    </w:p>
+    <w:p>
+      <w:pPr>
+        <w:numPr>
+          <w:ilvl w:val="0"/>
+          <w:numId w:val="0"/>
+        </w:numPr>
+        <w:pBdr>
+          <w:bottom w:val="single" w:color="auto" w:sz="4" w:space="0"/>
+        </w:pBdr>
+        <w:spacing w:line="240" w:lineRule="auto"/>
+        <w:ind w:leftChars="0"/>
+        <w:jc w:val="center"/>
+        <w:rPr>
+          <w:rFonts w:hint="default" w:ascii="Times New Roman" w:hAnsi="Times New Roman" w:eastAsia="SimSun" w:cs="Times New Roman"/>
+          <w:b/>
+          <w:bCs/>
+          <w:i/>
+          <w:iCs/>
+          <w:sz w:val="21"/>
+          <w:szCs w:val="21"/>
+          <w:lang w:val="en-US"/>
+        </w:rPr>
+      </w:pPr>
+    </w:p>
+    <w:p>
+      <w:pPr>
+        <w:numPr>
+          <w:ilvl w:val="0"/>
+          <w:numId w:val="0"/>
+        </w:numPr>
+        <w:pBdr>
+          <w:bottom w:val="single" w:color="auto" w:sz="4" w:space="0"/>
+        </w:pBdr>
+        <w:spacing w:line="240" w:lineRule="auto"/>
+        <w:ind w:leftChars="0"/>
+        <w:jc w:val="center"/>
+        <w:rPr>
+          <w:rFonts w:hint="default" w:ascii="Times New Roman" w:hAnsi="Times New Roman" w:eastAsia="SimSun" w:cs="Times New Roman"/>
+          <w:b/>
+          <w:bCs/>
+          <w:i/>
+          <w:iCs/>
+          <w:sz w:val="21"/>
+          <w:szCs w:val="21"/>
+          <w:lang w:val="en-US"/>
+        </w:rPr>
+      </w:pPr>
+    </w:p>
+    <w:p>
+      <w:pPr>
+        <w:numPr>
+          <w:ilvl w:val="0"/>
+          <w:numId w:val="0"/>
+        </w:numPr>
+        <w:pBdr>
+          <w:bottom w:val="single" w:color="auto" w:sz="4" w:space="0"/>
+        </w:pBdr>
+        <w:spacing w:line="240" w:lineRule="auto"/>
+        <w:ind w:leftChars="0"/>
+        <w:jc w:val="center"/>
+        <w:rPr>
+          <w:rFonts w:hint="default" w:ascii="Times New Roman" w:hAnsi="Times New Roman" w:eastAsia="SimSun" w:cs="Times New Roman"/>
+          <w:b/>
+          <w:bCs/>
+          <w:i/>
+          <w:iCs/>
+          <w:sz w:val="21"/>
+          <w:szCs w:val="21"/>
+          <w:lang w:val="en-US"/>
+        </w:rPr>
+      </w:pPr>
+    </w:p>
+    <w:p>
+      <w:pPr>
+        <w:numPr>
+          <w:ilvl w:val="0"/>
+          <w:numId w:val="0"/>
+        </w:numPr>
+        <w:pBdr>
+          <w:bottom w:val="single" w:color="auto" w:sz="4" w:space="0"/>
+        </w:pBdr>
+        <w:spacing w:line="240" w:lineRule="auto"/>
+        <w:ind w:leftChars="0"/>
+        <w:jc w:val="center"/>
+        <w:rPr>
+          <w:rFonts w:hint="default" w:ascii="Times New Roman" w:hAnsi="Times New Roman" w:eastAsia="SimSun" w:cs="Times New Roman"/>
+          <w:b/>
+          <w:bCs/>
+          <w:i/>
+          <w:iCs/>
+          <w:sz w:val="21"/>
+          <w:szCs w:val="21"/>
+          <w:lang w:val="en-US"/>
+        </w:rPr>
+      </w:pPr>
+    </w:p>
+    <w:p>
+      <w:pPr>
+        <w:numPr>
+          <w:ilvl w:val="0"/>
+          <w:numId w:val="0"/>
+        </w:numPr>
+        <w:pBdr>
+          <w:bottom w:val="single" w:color="auto" w:sz="4" w:space="0"/>
+        </w:pBdr>
+        <w:spacing w:line="240" w:lineRule="auto"/>
+        <w:ind w:leftChars="0"/>
+        <w:jc w:val="center"/>
+        <w:rPr>
+          <w:rFonts w:hint="default" w:ascii="Times New Roman" w:hAnsi="Times New Roman" w:eastAsia="SimSun" w:cs="Times New Roman"/>
+          <w:b/>
+          <w:bCs/>
+          <w:i/>
+          <w:iCs/>
+          <w:sz w:val="21"/>
+          <w:szCs w:val="21"/>
+          <w:lang w:val="en-US"/>
+        </w:rPr>
+      </w:pPr>
+    </w:p>
+    <w:p>
+      <w:pPr>
+        <w:numPr>
+          <w:ilvl w:val="0"/>
+          <w:numId w:val="0"/>
+        </w:numPr>
+        <w:pBdr>
+          <w:bottom w:val="single" w:color="auto" w:sz="4" w:space="0"/>
+        </w:pBdr>
+        <w:spacing w:line="240" w:lineRule="auto"/>
+        <w:ind w:leftChars="0"/>
+        <w:jc w:val="center"/>
+        <w:rPr>
+          <w:rFonts w:hint="default" w:ascii="Times New Roman" w:hAnsi="Times New Roman" w:eastAsia="SimSun" w:cs="Times New Roman"/>
+          <w:b/>
+          <w:bCs/>
+          <w:i/>
+          <w:iCs/>
+          <w:sz w:val="21"/>
+          <w:szCs w:val="21"/>
+          <w:lang w:val="en-US"/>
+        </w:rPr>
+      </w:pPr>
+    </w:p>
+    <w:p>
+      <w:pPr>
+        <w:numPr>
+          <w:ilvl w:val="0"/>
+          <w:numId w:val="0"/>
+        </w:numPr>
+        <w:pBdr>
+          <w:bottom w:val="single" w:color="auto" w:sz="4" w:space="0"/>
+        </w:pBdr>
+        <w:spacing w:line="240" w:lineRule="auto"/>
+        <w:ind w:leftChars="0"/>
+        <w:jc w:val="center"/>
+        <w:rPr>
+          <w:rFonts w:hint="default" w:ascii="Times New Roman" w:hAnsi="Times New Roman" w:eastAsia="SimSun" w:cs="Times New Roman"/>
+          <w:b/>
+          <w:bCs/>
+          <w:i/>
+          <w:iCs/>
+          <w:sz w:val="21"/>
+          <w:szCs w:val="21"/>
+          <w:lang w:val="en-US"/>
+        </w:rPr>
+      </w:pPr>
+    </w:p>
+    <w:p>
+      <w:pPr>
+        <w:numPr>
+          <w:ilvl w:val="0"/>
+          <w:numId w:val="0"/>
+        </w:numPr>
+        <w:pBdr>
+          <w:bottom w:val="single" w:color="auto" w:sz="4" w:space="0"/>
+        </w:pBdr>
+        <w:spacing w:line="240" w:lineRule="auto"/>
+        <w:ind w:leftChars="0"/>
+        <w:jc w:val="center"/>
+        <w:rPr>
+          <w:rFonts w:hint="default" w:ascii="Times New Roman" w:hAnsi="Times New Roman" w:eastAsia="SimSun" w:cs="Times New Roman"/>
+          <w:b/>
+          <w:bCs/>
+          <w:i/>
+          <w:iCs/>
+          <w:sz w:val="21"/>
+          <w:szCs w:val="21"/>
+          <w:lang w:val="en-US"/>
+        </w:rPr>
+      </w:pPr>
+    </w:p>
+    <w:p>
+      <w:pPr>
+        <w:numPr>
+          <w:ilvl w:val="0"/>
+          <w:numId w:val="0"/>
+        </w:numPr>
+        <w:pBdr>
+          <w:bottom w:val="single" w:color="auto" w:sz="4" w:space="0"/>
+        </w:pBdr>
+        <w:spacing w:line="240" w:lineRule="auto"/>
+        <w:ind w:leftChars="0"/>
+        <w:jc w:val="center"/>
+        <w:rPr>
+          <w:rFonts w:hint="default" w:ascii="Times New Roman" w:hAnsi="Times New Roman" w:eastAsia="SimSun" w:cs="Times New Roman"/>
+          <w:b/>
+          <w:bCs/>
+          <w:i/>
+          <w:iCs/>
+          <w:sz w:val="21"/>
+          <w:szCs w:val="21"/>
+          <w:lang w:val="en-US"/>
+        </w:rPr>
+      </w:pPr>
+    </w:p>
+    <w:p>
+      <w:pPr>
+        <w:numPr>
+          <w:ilvl w:val="0"/>
+          <w:numId w:val="0"/>
+        </w:numPr>
+        <w:pBdr>
+          <w:bottom w:val="single" w:color="auto" w:sz="4" w:space="0"/>
+        </w:pBdr>
+        <w:spacing w:line="240" w:lineRule="auto"/>
+        <w:ind w:leftChars="0"/>
+        <w:jc w:val="center"/>
+        <w:rPr>
+          <w:rFonts w:hint="default" w:ascii="Times New Roman" w:hAnsi="Times New Roman" w:eastAsia="SimSun" w:cs="Times New Roman"/>
+          <w:b/>
+          <w:bCs/>
+          <w:i/>
+          <w:iCs/>
+          <w:sz w:val="21"/>
+          <w:szCs w:val="21"/>
+          <w:lang w:val="en-US"/>
+        </w:rPr>
+      </w:pPr>
+    </w:p>
+    <w:p>
+      <w:pPr>
+        <w:numPr>
+          <w:ilvl w:val="0"/>
+          <w:numId w:val="0"/>
+        </w:numPr>
+        <w:pBdr>
+          <w:bottom w:val="single" w:color="auto" w:sz="4" w:space="0"/>
+        </w:pBdr>
+        <w:spacing w:line="240" w:lineRule="auto"/>
+        <w:ind w:leftChars="0"/>
+        <w:jc w:val="center"/>
+        <w:rPr>
+          <w:rFonts w:hint="default" w:ascii="Times New Roman" w:hAnsi="Times New Roman" w:eastAsia="SimSun" w:cs="Times New Roman"/>
+          <w:b/>
+          <w:bCs/>
+          <w:i/>
+          <w:iCs/>
+          <w:sz w:val="21"/>
+          <w:szCs w:val="21"/>
+        </w:rPr>
+      </w:pPr>
+      <w:r>
+        <w:rPr>
+          <w:rFonts w:hint="default" w:ascii="Times New Roman" w:hAnsi="Times New Roman" w:cs="Times New Roman"/>
+          <w:b/>
+          <w:bCs/>
+          <w:i/>
+          <w:iCs/>
+          <w:sz w:val="21"/>
+          <w:szCs w:val="21"/>
+          <w:lang w:val="en-US"/>
+        </w:rPr>
+        <w:t xml:space="preserve">Figure 19: </w:t>
+      </w:r>
+      <w:r>
+        <w:rPr>
+          <w:rFonts w:hint="default" w:ascii="Times New Roman" w:hAnsi="Times New Roman" w:eastAsia="SimSun" w:cs="Times New Roman"/>
+          <w:b/>
+          <w:bCs/>
+          <w:i/>
+          <w:iCs/>
+          <w:sz w:val="21"/>
+          <w:szCs w:val="21"/>
+        </w:rPr>
+        <w:t>Query Result Showing Actor Movie Counts (Pass 1h)</w:t>
+      </w:r>
+    </w:p>
+    <w:p>
+      <w:pPr>
+        <w:numPr>
+          <w:ilvl w:val="0"/>
+          <w:numId w:val="0"/>
+        </w:numPr>
+        <w:pBdr>
+          <w:bottom w:val="single" w:color="auto" w:sz="4" w:space="0"/>
+        </w:pBdr>
+        <w:spacing w:line="240" w:lineRule="auto"/>
+        <w:ind w:leftChars="0"/>
+        <w:jc w:val="center"/>
+        <w:rPr>
+          <w:rFonts w:hint="default" w:ascii="Times New Roman" w:hAnsi="Times New Roman" w:eastAsia="SimSun" w:cs="Times New Roman"/>
+          <w:b/>
+          <w:bCs/>
+          <w:i/>
+          <w:iCs/>
+          <w:sz w:val="21"/>
+          <w:szCs w:val="21"/>
         </w:rPr>
       </w:pPr>
     </w:p>
@@ -7595,7 +8674,7 @@
           <w:szCs w:val="21"/>
         </w:rPr>
         <w:drawing>
-          <wp:anchor distT="0" distB="0" distL="114300" distR="114300" simplePos="0" relativeHeight="251678720" behindDoc="0" locked="0" layoutInCell="1" allowOverlap="1">
+          <wp:anchor distT="0" distB="0" distL="114300" distR="114300" simplePos="0" relativeHeight="251673600" behindDoc="0" locked="0" layoutInCell="1" allowOverlap="1">
             <wp:simplePos x="0" y="0"/>
             <wp:positionH relativeFrom="column">
               <wp:posOffset>1227455</wp:posOffset>
@@ -7814,7 +8893,7 @@
           <w:szCs w:val="21"/>
         </w:rPr>
         <w:drawing>
-          <wp:anchor distT="0" distB="0" distL="114300" distR="114300" simplePos="0" relativeHeight="251679744" behindDoc="0" locked="0" layoutInCell="1" allowOverlap="1">
+          <wp:anchor distT="0" distB="0" distL="114300" distR="114300" simplePos="0" relativeHeight="251674624" behindDoc="0" locked="0" layoutInCell="1" allowOverlap="1">
             <wp:simplePos x="0" y="0"/>
             <wp:positionH relativeFrom="column">
               <wp:posOffset>1387475</wp:posOffset>
@@ -8096,7 +9175,7 @@
           <w:szCs w:val="21"/>
         </w:rPr>
         <w:drawing>
-          <wp:anchor distT="0" distB="0" distL="114300" distR="114300" simplePos="0" relativeHeight="251680768" behindDoc="1" locked="0" layoutInCell="1" allowOverlap="1">
+          <wp:anchor distT="0" distB="0" distL="114300" distR="114300" simplePos="0" relativeHeight="251675648" behindDoc="1" locked="0" layoutInCell="1" allowOverlap="1">
             <wp:simplePos x="0" y="0"/>
             <wp:positionH relativeFrom="column">
               <wp:posOffset>1905</wp:posOffset>
@@ -8247,7 +9326,7 @@
       </w:pPr>
       <w:r>
         <w:drawing>
-          <wp:anchor distT="0" distB="0" distL="114300" distR="114300" simplePos="0" relativeHeight="251681792" behindDoc="0" locked="0" layoutInCell="1" allowOverlap="1">
+          <wp:anchor distT="0" distB="0" distL="114300" distR="114300" simplePos="0" relativeHeight="251676672" behindDoc="0" locked="0" layoutInCell="1" allowOverlap="1">
             <wp:simplePos x="0" y="0"/>
             <wp:positionH relativeFrom="column">
               <wp:posOffset>3810</wp:posOffset>
@@ -8375,7 +9454,7 @@
       </w:pPr>
       <w:r>
         <w:drawing>
-          <wp:anchor distT="0" distB="0" distL="114300" distR="114300" simplePos="0" relativeHeight="251682816" behindDoc="0" locked="0" layoutInCell="1" allowOverlap="1">
+          <wp:anchor distT="0" distB="0" distL="114300" distR="114300" simplePos="0" relativeHeight="251677696" behindDoc="0" locked="0" layoutInCell="1" allowOverlap="1">
             <wp:simplePos x="0" y="0"/>
             <wp:positionH relativeFrom="column">
               <wp:posOffset>3810</wp:posOffset>
@@ -8474,7 +9553,7 @@
       </w:pPr>
       <w:r>
         <w:drawing>
-          <wp:anchor distT="0" distB="0" distL="114300" distR="114300" simplePos="0" relativeHeight="251683840" behindDoc="1" locked="0" layoutInCell="1" allowOverlap="1">
+          <wp:anchor distT="0" distB="0" distL="114300" distR="114300" simplePos="0" relativeHeight="251678720" behindDoc="1" locked="0" layoutInCell="1" allowOverlap="1">
             <wp:simplePos x="0" y="0"/>
             <wp:positionH relativeFrom="column">
               <wp:posOffset>1120775</wp:posOffset>
@@ -8612,7 +9691,7 @@
           <w:szCs w:val="21"/>
         </w:rPr>
         <w:drawing>
-          <wp:anchor distT="0" distB="0" distL="114300" distR="114300" simplePos="0" relativeHeight="251684864" behindDoc="1" locked="0" layoutInCell="1" allowOverlap="1">
+          <wp:anchor distT="0" distB="0" distL="114300" distR="114300" simplePos="0" relativeHeight="251679744" behindDoc="1" locked="0" layoutInCell="1" allowOverlap="1">
             <wp:simplePos x="0" y="0"/>
             <wp:positionH relativeFrom="column">
               <wp:posOffset>2540</wp:posOffset>
@@ -8750,7 +9829,7 @@
           <w:szCs w:val="21"/>
         </w:rPr>
         <w:drawing>
-          <wp:anchor distT="0" distB="0" distL="114300" distR="114300" simplePos="0" relativeHeight="251685888" behindDoc="1" locked="0" layoutInCell="1" allowOverlap="1">
+          <wp:anchor distT="0" distB="0" distL="114300" distR="114300" simplePos="0" relativeHeight="251680768" behindDoc="1" locked="0" layoutInCell="1" allowOverlap="1">
             <wp:simplePos x="0" y="0"/>
             <wp:positionH relativeFrom="column">
               <wp:posOffset>5080</wp:posOffset>
@@ -8873,8 +9952,6 @@
           <w:lang w:val="en-US"/>
         </w:rPr>
       </w:pPr>
-      <w:bookmarkStart w:id="0" w:name="_GoBack"/>
-      <w:bookmarkEnd w:id="0"/>
     </w:p>
     <w:sectPr>
       <w:pgSz w:w="11906" w:h="16838"/>
@@ -9123,7 +10200,7 @@
     <w:lsdException w:unhideWhenUsed="0" w:uiPriority="0" w:semiHidden="0" w:name="HTML Acronym"/>
     <w:lsdException w:unhideWhenUsed="0" w:uiPriority="0" w:semiHidden="0" w:name="HTML Address"/>
     <w:lsdException w:unhideWhenUsed="0" w:uiPriority="0" w:semiHidden="0" w:name="HTML Cite"/>
-    <w:lsdException w:unhideWhenUsed="0" w:uiPriority="0" w:semiHidden="0" w:name="HTML Code"/>
+    <w:lsdException w:qFormat="1" w:unhideWhenUsed="0" w:uiPriority="0" w:semiHidden="0" w:name="HTML Code"/>
     <w:lsdException w:unhideWhenUsed="0" w:uiPriority="0" w:semiHidden="0" w:name="HTML Definition"/>
     <w:lsdException w:unhideWhenUsed="0" w:uiPriority="0" w:semiHidden="0" w:name="HTML Keyboard"/>
     <w:lsdException w:unhideWhenUsed="0" w:uiPriority="0" w:semiHidden="0" w:name="HTML Preformatted"/>
@@ -9380,6 +10457,7 @@
   <w:style w:type="character" w:styleId="7">
     <w:name w:val="HTML Code"/>
     <w:basedOn w:val="5"/>
+    <w:qFormat/>
     <w:uiPriority w:val="0"/>
     <w:rPr>
       <w:rFonts w:ascii="Courier New" w:hAnsi="Courier New" w:cs="Courier New"/>

</xml_diff>

<commit_message>
Finish Lab01 (Add .zip File)
</commit_message>
<xml_diff>
--- a/Laboratory/Task01/TO1P-1.docx
+++ b/Laboratory/Task01/TO1P-1.docx
@@ -2392,7 +2392,7 @@
       </w:pPr>
       <w:r>
         <w:drawing>
-          <wp:anchor distT="0" distB="0" distL="114300" distR="114300" simplePos="0" relativeHeight="251681792" behindDoc="0" locked="0" layoutInCell="1" allowOverlap="1">
+          <wp:anchor distT="0" distB="0" distL="114300" distR="114300" simplePos="0" relativeHeight="251680768" behindDoc="0" locked="0" layoutInCell="1" allowOverlap="1">
             <wp:simplePos x="0" y="0"/>
             <wp:positionH relativeFrom="column">
               <wp:posOffset>735965</wp:posOffset>
@@ -2595,7 +2595,7 @@
       </w:pPr>
       <w:r>
         <w:drawing>
-          <wp:anchor distT="0" distB="0" distL="114300" distR="114300" simplePos="0" relativeHeight="251682816" behindDoc="1" locked="0" layoutInCell="1" allowOverlap="1">
+          <wp:anchor distT="0" distB="0" distL="114300" distR="114300" simplePos="0" relativeHeight="251681792" behindDoc="1" locked="0" layoutInCell="1" allowOverlap="1">
             <wp:simplePos x="0" y="0"/>
             <wp:positionH relativeFrom="column">
               <wp:posOffset>846455</wp:posOffset>
@@ -3335,7 +3335,7 @@
           <w:szCs w:val="25"/>
           <w:lang w:val="en-US"/>
         </w:rPr>
-        <w:t xml:space="preserve">After downloading the file moviedatasetDAD.accdb, I changed namd following files including </w:t>
+        <w:t xml:space="preserve">After downloading the file moviedatasetDAD.accdb, I renamed the following tables including </w:t>
       </w:r>
       <w:r>
         <w:rPr>
@@ -4098,7 +4098,7 @@
       </w:pPr>
       <w:r>
         <w:drawing>
-          <wp:anchor distT="0" distB="0" distL="114300" distR="114300" simplePos="0" relativeHeight="251684864" behindDoc="1" locked="0" layoutInCell="1" allowOverlap="1">
+          <wp:anchor distT="0" distB="0" distL="114300" distR="114300" simplePos="0" relativeHeight="251683840" behindDoc="1" locked="0" layoutInCell="1" allowOverlap="1">
             <wp:simplePos x="0" y="0"/>
             <wp:positionH relativeFrom="column">
               <wp:posOffset>1270</wp:posOffset>
@@ -4222,7 +4222,7 @@
       </w:pPr>
       <w:r>
         <w:drawing>
-          <wp:anchor distT="0" distB="0" distL="114300" distR="114300" simplePos="0" relativeHeight="251683840" behindDoc="0" locked="0" layoutInCell="1" allowOverlap="1">
+          <wp:anchor distT="0" distB="0" distL="114300" distR="114300" simplePos="0" relativeHeight="251682816" behindDoc="0" locked="0" layoutInCell="1" allowOverlap="1">
             <wp:simplePos x="0" y="0"/>
             <wp:positionH relativeFrom="column">
               <wp:posOffset>1905</wp:posOffset>
@@ -4744,7 +4744,22 @@
           <w:szCs w:val="25"/>
           <w:lang w:val="en-US"/>
         </w:rPr>
-        <w:t xml:space="preserve">According to the requirement of Task1d in the assignment, the data taks all columns from table named </w:t>
+        <w:t>According to the requirement of Task1d in the assignment, the query returns</w:t>
+      </w:r>
+      <w:bookmarkStart w:id="0" w:name="_GoBack"/>
+      <w:bookmarkEnd w:id="0"/>
+      <w:r>
+        <w:rPr>
+          <w:rFonts w:hint="default" w:ascii="Times New Roman" w:hAnsi="Times New Roman" w:eastAsia="SimSun" w:cs="Times New Roman"/>
+          <w:b w:val="0"/>
+          <w:bCs w:val="0"/>
+          <w:i w:val="0"/>
+          <w:iCs w:val="0"/>
+          <w:sz w:val="25"/>
+          <w:szCs w:val="25"/>
+          <w:lang w:val="en-US"/>
+        </w:rPr>
+        <w:t xml:space="preserve"> all columns from table named </w:t>
       </w:r>
       <w:r>
         <w:rPr>
@@ -6225,111 +6240,7 @@
           <w:szCs w:val="25"/>
           <w:lang w:val="en-US"/>
         </w:rPr>
-        <w:t xml:space="preserve">After that, pull out all five tables in the left side to the center and then create relationships. For example, when I connect </w:t>
-      </w:r>
-      <w:r>
-        <w:rPr>
-          <w:rFonts w:hint="default" w:ascii="Times New Roman" w:hAnsi="Times New Roman" w:cs="Times New Roman"/>
-          <w:b/>
-          <w:bCs/>
-          <w:i/>
-          <w:iCs/>
-          <w:sz w:val="25"/>
-          <w:szCs w:val="25"/>
-          <w:lang w:val="en-US"/>
-        </w:rPr>
-        <w:t>AutoNo</w:t>
-      </w:r>
-      <w:r>
-        <w:rPr>
-          <w:rFonts w:hint="default" w:ascii="Times New Roman" w:hAnsi="Times New Roman" w:cs="Times New Roman"/>
-          <w:b w:val="0"/>
-          <w:bCs w:val="0"/>
-          <w:i w:val="0"/>
-          <w:iCs w:val="0"/>
-          <w:sz w:val="25"/>
-          <w:szCs w:val="25"/>
-          <w:lang w:val="en-US"/>
-        </w:rPr>
-        <w:t xml:space="preserve"> in the table </w:t>
-      </w:r>
-      <w:r>
-        <w:rPr>
-          <w:rFonts w:hint="default" w:ascii="Times New Roman" w:hAnsi="Times New Roman" w:cs="Times New Roman"/>
-          <w:b/>
-          <w:bCs/>
-          <w:i/>
-          <w:iCs/>
-          <w:sz w:val="25"/>
-          <w:szCs w:val="25"/>
-          <w:lang w:val="en-US"/>
-        </w:rPr>
-        <w:t>ACTOR5520</w:t>
-      </w:r>
-      <w:r>
-        <w:rPr>
-          <w:rFonts w:hint="default" w:ascii="Times New Roman" w:hAnsi="Times New Roman" w:cs="Times New Roman"/>
-          <w:b w:val="0"/>
-          <w:bCs w:val="0"/>
-          <w:i w:val="0"/>
-          <w:iCs w:val="0"/>
-          <w:sz w:val="25"/>
-          <w:szCs w:val="25"/>
-          <w:lang w:val="en-US"/>
-        </w:rPr>
-        <w:t xml:space="preserve"> to </w:t>
-      </w:r>
-      <w:r>
-        <w:rPr>
-          <w:rFonts w:hint="default" w:ascii="Times New Roman" w:hAnsi="Times New Roman" w:cs="Times New Roman"/>
-          <w:b/>
-          <w:bCs/>
-          <w:i/>
-          <w:iCs/>
-          <w:sz w:val="25"/>
-          <w:szCs w:val="25"/>
-          <w:lang w:val="en-US"/>
-        </w:rPr>
-        <w:t>AutoNo</w:t>
-      </w:r>
-      <w:r>
-        <w:rPr>
-          <w:rFonts w:hint="default" w:ascii="Times New Roman" w:hAnsi="Times New Roman" w:cs="Times New Roman"/>
-          <w:b w:val="0"/>
-          <w:bCs w:val="0"/>
-          <w:i w:val="0"/>
-          <w:iCs w:val="0"/>
-          <w:sz w:val="25"/>
-          <w:szCs w:val="25"/>
-          <w:lang w:val="en-US"/>
-        </w:rPr>
-        <w:t xml:space="preserve"> in table</w:t>
-      </w:r>
-      <w:r>
-        <w:rPr>
-          <w:rFonts w:hint="default" w:ascii="Times New Roman" w:hAnsi="Times New Roman" w:cs="Times New Roman"/>
-          <w:b/>
-          <w:bCs/>
-          <w:i/>
-          <w:iCs/>
-          <w:sz w:val="25"/>
-          <w:szCs w:val="25"/>
-          <w:lang w:val="en-US"/>
-        </w:rPr>
-        <w:t xml:space="preserve"> CASTING5520,</w:t>
-      </w:r>
-      <w:r>
-        <w:rPr>
-          <w:rFonts w:hint="default" w:ascii="Times New Roman" w:hAnsi="Times New Roman" w:cs="Times New Roman"/>
-          <w:b w:val="0"/>
-          <w:bCs w:val="0"/>
-          <w:i w:val="0"/>
-          <w:iCs w:val="0"/>
-          <w:sz w:val="25"/>
-          <w:szCs w:val="25"/>
-          <w:lang w:val="en-US"/>
-        </w:rPr>
-        <w:t xml:space="preserve"> a box configuration displays then tick the first option.</w:t>
+        <w:t>After that, pull out all five tables in the left side to the center and then create relationships. For instance, connecting the primary key ActorNo in ACTOR5520 table with foreign key ActorNo in CASTING5520 table.</w:t>
       </w:r>
     </w:p>
     <w:p>
@@ -8028,10 +7939,9 @@
         </w:rPr>
         <w:br w:type="textWrapping"/>
       </w:r>
-      <w:bookmarkStart w:id="0" w:name="_GoBack"/>
       <w:r>
         <w:drawing>
-          <wp:anchor distT="0" distB="0" distL="114300" distR="114300" simplePos="0" relativeHeight="251685888" behindDoc="1" locked="0" layoutInCell="1" allowOverlap="1">
+          <wp:anchor distT="0" distB="0" distL="114300" distR="114300" simplePos="0" relativeHeight="251684864" behindDoc="1" locked="0" layoutInCell="1" allowOverlap="1">
             <wp:simplePos x="0" y="0"/>
             <wp:positionH relativeFrom="column">
               <wp:posOffset>960755</wp:posOffset>
@@ -8088,7 +7998,6 @@
           </wp:anchor>
         </w:drawing>
       </w:r>
-      <w:bookmarkEnd w:id="0"/>
       <w:r>
         <w:rPr>
           <w:rFonts w:hint="default" w:ascii="Times New Roman" w:hAnsi="Times New Roman" w:eastAsia="SimSun" w:cs="Times New Roman"/>
@@ -9792,7 +9701,7 @@
     <w:p>
       <w:pPr>
         <w:ind w:left="0" w:leftChars="0" w:firstLine="0" w:firstLineChars="0"/>
-        <w:jc w:val="center"/>
+        <w:jc w:val="both"/>
         <w:rPr>
           <w:rFonts w:hint="default" w:ascii="Times New Roman" w:hAnsi="Times New Roman" w:eastAsia="SimSun" w:cs="Times New Roman"/>
           <w:b/>
@@ -9807,48 +9716,76 @@
     <w:p>
       <w:pPr>
         <w:ind w:left="0" w:leftChars="0" w:firstLine="0" w:firstLineChars="0"/>
-        <w:jc w:val="center"/>
-        <w:rPr>
-          <w:rFonts w:hint="default" w:ascii="Times New Roman" w:hAnsi="Times New Roman" w:eastAsia="SimSun" w:cs="Times New Roman"/>
-          <w:b/>
-          <w:bCs/>
-          <w:i/>
-          <w:iCs/>
-          <w:sz w:val="21"/>
-          <w:szCs w:val="21"/>
-        </w:rPr>
-      </w:pPr>
-      <w:r>
-        <w:rPr>
-          <w:rFonts w:hint="default" w:ascii="Times New Roman" w:hAnsi="Times New Roman" w:cs="Times New Roman"/>
-          <w:b/>
-          <w:bCs/>
-          <w:i/>
-          <w:iCs/>
-          <w:sz w:val="21"/>
-          <w:szCs w:val="21"/>
-        </w:rPr>
+        <w:jc w:val="both"/>
+        <w:rPr>
+          <w:rFonts w:hint="default" w:ascii="Times New Roman" w:hAnsi="Times New Roman" w:eastAsia="SimSun" w:cs="Times New Roman"/>
+          <w:b/>
+          <w:bCs/>
+          <w:i/>
+          <w:iCs/>
+          <w:sz w:val="21"/>
+          <w:szCs w:val="21"/>
+        </w:rPr>
+      </w:pPr>
+    </w:p>
+    <w:p>
+      <w:pPr>
+        <w:ind w:left="0" w:leftChars="0" w:firstLine="0" w:firstLineChars="0"/>
+        <w:jc w:val="both"/>
+        <w:rPr>
+          <w:rFonts w:hint="default" w:ascii="Times New Roman" w:hAnsi="Times New Roman" w:eastAsia="SimSun" w:cs="Times New Roman"/>
+          <w:b/>
+          <w:bCs/>
+          <w:i/>
+          <w:iCs/>
+          <w:sz w:val="21"/>
+          <w:szCs w:val="21"/>
+        </w:rPr>
+      </w:pPr>
+    </w:p>
+    <w:p>
+      <w:pPr>
+        <w:ind w:left="0" w:leftChars="0" w:firstLine="0" w:firstLineChars="0"/>
+        <w:jc w:val="both"/>
+        <w:rPr>
+          <w:rFonts w:hint="default" w:ascii="Times New Roman" w:hAnsi="Times New Roman" w:eastAsia="SimSun" w:cs="Times New Roman"/>
+          <w:b/>
+          <w:bCs/>
+          <w:i/>
+          <w:iCs/>
+          <w:sz w:val="21"/>
+          <w:szCs w:val="21"/>
+        </w:rPr>
+      </w:pPr>
+    </w:p>
+    <w:p>
+      <w:pPr>
+        <w:ind w:left="0" w:leftChars="0" w:firstLine="0" w:firstLineChars="0"/>
+        <w:jc w:val="both"/>
+        <w:rPr>
+          <w:rFonts w:hint="default" w:ascii="Times New Roman" w:hAnsi="Times New Roman" w:eastAsia="SimSun" w:cs="Times New Roman"/>
+          <w:b w:val="0"/>
+          <w:bCs w:val="0"/>
+          <w:i/>
+          <w:iCs/>
+          <w:sz w:val="21"/>
+          <w:szCs w:val="21"/>
+        </w:rPr>
+      </w:pPr>
+      <w:r>
         <w:drawing>
-          <wp:anchor distT="0" distB="0" distL="114300" distR="114300" simplePos="0" relativeHeight="251680768" behindDoc="1" locked="0" layoutInCell="1" allowOverlap="1">
+          <wp:anchor distT="0" distB="0" distL="114300" distR="114300" simplePos="0" relativeHeight="251685888" behindDoc="0" locked="0" layoutInCell="1" allowOverlap="1">
             <wp:simplePos x="0" y="0"/>
             <wp:positionH relativeFrom="column">
-              <wp:posOffset>5080</wp:posOffset>
+              <wp:posOffset>2540</wp:posOffset>
             </wp:positionH>
             <wp:positionV relativeFrom="paragraph">
-              <wp:posOffset>97155</wp:posOffset>
+              <wp:posOffset>0</wp:posOffset>
             </wp:positionV>
-            <wp:extent cx="5264150" cy="669290"/>
-            <wp:effectExtent l="0" t="0" r="8890" b="1270"/>
-            <wp:wrapTight wrapText="bothSides">
-              <wp:wrapPolygon>
-                <wp:start x="0" y="0"/>
-                <wp:lineTo x="0" y="21149"/>
-                <wp:lineTo x="21511" y="21149"/>
-                <wp:lineTo x="21511" y="0"/>
-                <wp:lineTo x="0" y="0"/>
-              </wp:wrapPolygon>
-            </wp:wrapTight>
-            <wp:docPr id="28" name="Picture 11"/>
+            <wp:extent cx="5269230" cy="1280795"/>
+            <wp:effectExtent l="0" t="0" r="3810" b="14605"/>
+            <wp:wrapSquare wrapText="bothSides"/>
+            <wp:docPr id="3" name="Picture 1"/>
             <wp:cNvGraphicFramePr>
               <a:graphicFrameLocks xmlns:a="http://schemas.openxmlformats.org/drawingml/2006/main" noChangeAspect="1"/>
             </wp:cNvGraphicFramePr>
@@ -9856,7 +9793,7 @@
               <a:graphicData uri="http://schemas.openxmlformats.org/drawingml/2006/picture">
                 <pic:pic xmlns:pic="http://schemas.openxmlformats.org/drawingml/2006/picture">
                   <pic:nvPicPr>
-                    <pic:cNvPr id="28" name="Picture 11"/>
+                    <pic:cNvPr id="3" name="Picture 1"/>
                     <pic:cNvPicPr>
                       <a:picLocks noChangeAspect="1"/>
                     </pic:cNvPicPr>
@@ -9870,7 +9807,7 @@
                   <pic:spPr>
                     <a:xfrm>
                       <a:off x="0" y="0"/>
-                      <a:ext cx="5264150" cy="669290"/>
+                      <a:ext cx="5269230" cy="1280795"/>
                     </a:xfrm>
                     <a:prstGeom prst="rect">
                       <a:avLst/>
@@ -9886,6 +9823,21 @@
           </wp:anchor>
         </w:drawing>
       </w:r>
+    </w:p>
+    <w:p>
+      <w:pPr>
+        <w:ind w:left="0" w:leftChars="0" w:firstLine="0" w:firstLineChars="0"/>
+        <w:jc w:val="center"/>
+        <w:rPr>
+          <w:rFonts w:hint="default" w:ascii="Times New Roman" w:hAnsi="Times New Roman" w:eastAsia="SimSun" w:cs="Times New Roman"/>
+          <w:b/>
+          <w:bCs/>
+          <w:i/>
+          <w:iCs/>
+          <w:sz w:val="21"/>
+          <w:szCs w:val="21"/>
+        </w:rPr>
+      </w:pPr>
       <w:r>
         <w:rPr>
           <w:rFonts w:hint="default" w:ascii="Times New Roman" w:hAnsi="Times New Roman" w:eastAsia="SimSun" w:cs="Times New Roman"/>
@@ -9936,6 +9888,22 @@
         </w:rPr>
         <w:t xml:space="preserve"> (Casting, Movie, and Actor Information)</w:t>
       </w:r>
+    </w:p>
+    <w:p>
+      <w:pPr>
+        <w:ind w:left="0" w:leftChars="0" w:firstLine="0" w:firstLineChars="0"/>
+        <w:jc w:val="center"/>
+        <w:rPr>
+          <w:rFonts w:hint="default" w:ascii="Times New Roman" w:hAnsi="Times New Roman" w:eastAsia="SimSun" w:cs="Times New Roman"/>
+          <w:b/>
+          <w:bCs/>
+          <w:i/>
+          <w:iCs/>
+          <w:sz w:val="21"/>
+          <w:szCs w:val="21"/>
+          <w:lang w:val="en-US"/>
+        </w:rPr>
+      </w:pPr>
     </w:p>
     <w:p>
       <w:pPr>

</xml_diff>

<commit_message>
Completely Finish Lab01 - Task Pass and Credit
</commit_message>
<xml_diff>
--- a/Laboratory/Task01/TO1P-1.docx
+++ b/Laboratory/Task01/TO1P-1.docx
@@ -4744,22 +4744,7 @@
           <w:szCs w:val="25"/>
           <w:lang w:val="en-US"/>
         </w:rPr>
-        <w:t>According to the requirement of Task1d in the assignment, the query returns</w:t>
-      </w:r>
-      <w:bookmarkStart w:id="0" w:name="_GoBack"/>
-      <w:bookmarkEnd w:id="0"/>
-      <w:r>
-        <w:rPr>
-          <w:rFonts w:hint="default" w:ascii="Times New Roman" w:hAnsi="Times New Roman" w:eastAsia="SimSun" w:cs="Times New Roman"/>
-          <w:b w:val="0"/>
-          <w:bCs w:val="0"/>
-          <w:i w:val="0"/>
-          <w:iCs w:val="0"/>
-          <w:sz w:val="25"/>
-          <w:szCs w:val="25"/>
-          <w:lang w:val="en-US"/>
-        </w:rPr>
-        <w:t xml:space="preserve"> all columns from table named </w:t>
+        <w:t xml:space="preserve">According to the requirement of Task1d in the assignment, the query returns all columns from table named </w:t>
       </w:r>
       <w:r>
         <w:rPr>
@@ -7622,345 +7607,28 @@
           <w:szCs w:val="21"/>
         </w:rPr>
       </w:pPr>
-    </w:p>
-    <w:p>
-      <w:pPr>
-        <w:numPr>
-          <w:ilvl w:val="0"/>
-          <w:numId w:val="0"/>
-        </w:numPr>
-        <w:spacing w:line="240" w:lineRule="auto"/>
-        <w:ind w:leftChars="0"/>
-        <w:jc w:val="center"/>
-        <w:rPr>
-          <w:rFonts w:hint="default" w:ascii="Times New Roman" w:hAnsi="Times New Roman" w:eastAsia="SimSun" w:cs="Times New Roman"/>
-          <w:b/>
-          <w:bCs/>
-          <w:i/>
-          <w:iCs/>
-          <w:sz w:val="21"/>
-          <w:szCs w:val="21"/>
-        </w:rPr>
-      </w:pPr>
-    </w:p>
-    <w:p>
-      <w:pPr>
-        <w:numPr>
-          <w:ilvl w:val="0"/>
-          <w:numId w:val="0"/>
-        </w:numPr>
-        <w:pBdr>
-          <w:bottom w:val="single" w:color="auto" w:sz="4" w:space="0"/>
-        </w:pBdr>
-        <w:spacing w:line="240" w:lineRule="auto"/>
-        <w:ind w:leftChars="0"/>
-        <w:jc w:val="center"/>
-        <w:rPr>
-          <w:rFonts w:hint="default" w:ascii="Times New Roman" w:hAnsi="Times New Roman" w:eastAsia="SimSun" w:cs="Times New Roman"/>
-          <w:b/>
-          <w:bCs/>
-          <w:i/>
-          <w:iCs/>
-          <w:sz w:val="21"/>
-          <w:szCs w:val="21"/>
-          <w:lang w:val="en-US"/>
-        </w:rPr>
-      </w:pPr>
-      <w:r>
-        <w:rPr>
-          <w:rFonts w:hint="default" w:ascii="Times New Roman" w:hAnsi="Times New Roman" w:eastAsia="SimSun" w:cs="Times New Roman"/>
-          <w:b/>
-          <w:bCs/>
-          <w:i/>
-          <w:iCs/>
-          <w:sz w:val="21"/>
-          <w:szCs w:val="21"/>
-          <w:lang w:val="en-US"/>
-        </w:rPr>
-        <w:br w:type="textWrapping"/>
-      </w:r>
-      <w:r>
-        <w:rPr>
-          <w:rFonts w:hint="default" w:ascii="Times New Roman" w:hAnsi="Times New Roman" w:eastAsia="SimSun" w:cs="Times New Roman"/>
-          <w:b/>
-          <w:bCs/>
-          <w:i/>
-          <w:iCs/>
-          <w:sz w:val="21"/>
-          <w:szCs w:val="21"/>
-          <w:lang w:val="en-US"/>
-        </w:rPr>
-        <w:br w:type="textWrapping"/>
-      </w:r>
-      <w:r>
-        <w:rPr>
-          <w:rFonts w:hint="default" w:ascii="Times New Roman" w:hAnsi="Times New Roman" w:eastAsia="SimSun" w:cs="Times New Roman"/>
-          <w:b/>
-          <w:bCs/>
-          <w:i/>
-          <w:iCs/>
-          <w:sz w:val="21"/>
-          <w:szCs w:val="21"/>
-          <w:lang w:val="en-US"/>
-        </w:rPr>
-        <w:br w:type="textWrapping"/>
-      </w:r>
-      <w:r>
-        <w:rPr>
-          <w:rFonts w:hint="default" w:ascii="Times New Roman" w:hAnsi="Times New Roman" w:eastAsia="SimSun" w:cs="Times New Roman"/>
-          <w:b/>
-          <w:bCs/>
-          <w:i/>
-          <w:iCs/>
-          <w:sz w:val="21"/>
-          <w:szCs w:val="21"/>
-          <w:lang w:val="en-US"/>
-        </w:rPr>
-        <w:br w:type="textWrapping"/>
-      </w:r>
-      <w:r>
-        <w:rPr>
-          <w:rFonts w:hint="default" w:ascii="Times New Roman" w:hAnsi="Times New Roman" w:eastAsia="SimSun" w:cs="Times New Roman"/>
-          <w:b/>
-          <w:bCs/>
-          <w:i/>
-          <w:iCs/>
-          <w:sz w:val="21"/>
-          <w:szCs w:val="21"/>
-          <w:lang w:val="en-US"/>
-        </w:rPr>
-        <w:br w:type="textWrapping"/>
-      </w:r>
-      <w:r>
-        <w:rPr>
-          <w:rFonts w:hint="default" w:ascii="Times New Roman" w:hAnsi="Times New Roman" w:eastAsia="SimSun" w:cs="Times New Roman"/>
-          <w:b/>
-          <w:bCs/>
-          <w:i/>
-          <w:iCs/>
-          <w:sz w:val="21"/>
-          <w:szCs w:val="21"/>
-          <w:lang w:val="en-US"/>
-        </w:rPr>
-        <w:br w:type="textWrapping"/>
-      </w:r>
-      <w:r>
-        <w:rPr>
-          <w:rFonts w:hint="default" w:ascii="Times New Roman" w:hAnsi="Times New Roman" w:eastAsia="SimSun" w:cs="Times New Roman"/>
-          <w:b/>
-          <w:bCs/>
-          <w:i/>
-          <w:iCs/>
-          <w:sz w:val="21"/>
-          <w:szCs w:val="21"/>
-          <w:lang w:val="en-US"/>
-        </w:rPr>
-        <w:br w:type="textWrapping"/>
-      </w:r>
-      <w:r>
-        <w:rPr>
-          <w:rFonts w:hint="default" w:ascii="Times New Roman" w:hAnsi="Times New Roman" w:eastAsia="SimSun" w:cs="Times New Roman"/>
-          <w:b/>
-          <w:bCs/>
-          <w:i/>
-          <w:iCs/>
-          <w:sz w:val="21"/>
-          <w:szCs w:val="21"/>
-          <w:lang w:val="en-US"/>
-        </w:rPr>
-        <w:br w:type="textWrapping"/>
-      </w:r>
-      <w:r>
-        <w:rPr>
-          <w:rFonts w:hint="default" w:ascii="Times New Roman" w:hAnsi="Times New Roman" w:eastAsia="SimSun" w:cs="Times New Roman"/>
-          <w:b/>
-          <w:bCs/>
-          <w:i/>
-          <w:iCs/>
-          <w:sz w:val="21"/>
-          <w:szCs w:val="21"/>
-          <w:lang w:val="en-US"/>
-        </w:rPr>
-        <w:br w:type="textWrapping"/>
-      </w:r>
-      <w:r>
-        <w:rPr>
-          <w:rFonts w:hint="default" w:ascii="Times New Roman" w:hAnsi="Times New Roman" w:eastAsia="SimSun" w:cs="Times New Roman"/>
-          <w:b/>
-          <w:bCs/>
-          <w:i/>
-          <w:iCs/>
-          <w:sz w:val="21"/>
-          <w:szCs w:val="21"/>
-          <w:lang w:val="en-US"/>
-        </w:rPr>
-        <w:br w:type="textWrapping"/>
-      </w:r>
-      <w:r>
-        <w:rPr>
-          <w:rFonts w:hint="default" w:ascii="Times New Roman" w:hAnsi="Times New Roman" w:eastAsia="SimSun" w:cs="Times New Roman"/>
-          <w:b/>
-          <w:bCs/>
-          <w:i/>
-          <w:iCs/>
-          <w:sz w:val="21"/>
-          <w:szCs w:val="21"/>
-          <w:lang w:val="en-US"/>
-        </w:rPr>
-        <w:br w:type="textWrapping"/>
-      </w:r>
-      <w:r>
-        <w:rPr>
-          <w:rFonts w:hint="default" w:ascii="Times New Roman" w:hAnsi="Times New Roman" w:eastAsia="SimSun" w:cs="Times New Roman"/>
-          <w:b/>
-          <w:bCs/>
-          <w:i/>
-          <w:iCs/>
-          <w:sz w:val="21"/>
-          <w:szCs w:val="21"/>
-          <w:lang w:val="en-US"/>
-        </w:rPr>
-        <w:br w:type="textWrapping"/>
-      </w:r>
-      <w:r>
-        <w:rPr>
-          <w:rFonts w:hint="default" w:ascii="Times New Roman" w:hAnsi="Times New Roman" w:eastAsia="SimSun" w:cs="Times New Roman"/>
-          <w:b/>
-          <w:bCs/>
-          <w:i/>
-          <w:iCs/>
-          <w:sz w:val="21"/>
-          <w:szCs w:val="21"/>
-          <w:lang w:val="en-US"/>
-        </w:rPr>
-        <w:br w:type="textWrapping"/>
-      </w:r>
-      <w:r>
-        <w:rPr>
-          <w:rFonts w:hint="default" w:ascii="Times New Roman" w:hAnsi="Times New Roman" w:eastAsia="SimSun" w:cs="Times New Roman"/>
-          <w:b/>
-          <w:bCs/>
-          <w:i/>
-          <w:iCs/>
-          <w:sz w:val="21"/>
-          <w:szCs w:val="21"/>
-          <w:lang w:val="en-US"/>
-        </w:rPr>
-        <w:br w:type="textWrapping"/>
-      </w:r>
-      <w:r>
-        <w:rPr>
-          <w:rFonts w:hint="default" w:ascii="Times New Roman" w:hAnsi="Times New Roman" w:eastAsia="SimSun" w:cs="Times New Roman"/>
-          <w:b/>
-          <w:bCs/>
-          <w:i/>
-          <w:iCs/>
-          <w:sz w:val="21"/>
-          <w:szCs w:val="21"/>
-          <w:lang w:val="en-US"/>
-        </w:rPr>
-        <w:br w:type="textWrapping"/>
-      </w:r>
-      <w:r>
-        <w:rPr>
-          <w:rFonts w:hint="default" w:ascii="Times New Roman" w:hAnsi="Times New Roman" w:eastAsia="SimSun" w:cs="Times New Roman"/>
-          <w:b/>
-          <w:bCs/>
-          <w:i/>
-          <w:iCs/>
-          <w:sz w:val="21"/>
-          <w:szCs w:val="21"/>
-          <w:lang w:val="en-US"/>
-        </w:rPr>
-        <w:br w:type="textWrapping"/>
-      </w:r>
-      <w:r>
-        <w:rPr>
-          <w:rFonts w:hint="default" w:ascii="Times New Roman" w:hAnsi="Times New Roman" w:eastAsia="SimSun" w:cs="Times New Roman"/>
-          <w:b/>
-          <w:bCs/>
-          <w:i/>
-          <w:iCs/>
-          <w:sz w:val="21"/>
-          <w:szCs w:val="21"/>
-          <w:lang w:val="en-US"/>
-        </w:rPr>
-        <w:br w:type="textWrapping"/>
-      </w:r>
-      <w:r>
-        <w:rPr>
-          <w:rFonts w:hint="default" w:ascii="Times New Roman" w:hAnsi="Times New Roman" w:eastAsia="SimSun" w:cs="Times New Roman"/>
-          <w:b/>
-          <w:bCs/>
-          <w:i/>
-          <w:iCs/>
-          <w:sz w:val="21"/>
-          <w:szCs w:val="21"/>
-          <w:lang w:val="en-US"/>
-        </w:rPr>
-        <w:br w:type="textWrapping"/>
-      </w:r>
-      <w:r>
-        <w:rPr>
-          <w:rFonts w:hint="default" w:ascii="Times New Roman" w:hAnsi="Times New Roman" w:eastAsia="SimSun" w:cs="Times New Roman"/>
-          <w:b/>
-          <w:bCs/>
-          <w:i/>
-          <w:iCs/>
-          <w:sz w:val="21"/>
-          <w:szCs w:val="21"/>
-          <w:lang w:val="en-US"/>
-        </w:rPr>
-        <w:br w:type="textWrapping"/>
-      </w:r>
-      <w:r>
-        <w:rPr>
-          <w:rFonts w:hint="default" w:ascii="Times New Roman" w:hAnsi="Times New Roman" w:eastAsia="SimSun" w:cs="Times New Roman"/>
-          <w:b/>
-          <w:bCs/>
-          <w:i/>
-          <w:iCs/>
-          <w:sz w:val="21"/>
-          <w:szCs w:val="21"/>
-          <w:lang w:val="en-US"/>
-        </w:rPr>
-        <w:br w:type="textWrapping"/>
-      </w:r>
-      <w:r>
-        <w:rPr>
-          <w:rFonts w:hint="default" w:ascii="Times New Roman" w:hAnsi="Times New Roman" w:eastAsia="SimSun" w:cs="Times New Roman"/>
-          <w:b/>
-          <w:bCs/>
-          <w:i/>
-          <w:iCs/>
-          <w:sz w:val="21"/>
-          <w:szCs w:val="21"/>
-          <w:lang w:val="en-US"/>
-        </w:rPr>
-        <w:br w:type="textWrapping"/>
-      </w:r>
       <w:r>
         <w:drawing>
-          <wp:anchor distT="0" distB="0" distL="114300" distR="114300" simplePos="0" relativeHeight="251684864" behindDoc="1" locked="0" layoutInCell="1" allowOverlap="1">
+          <wp:anchor distT="0" distB="0" distL="114300" distR="114300" simplePos="0" relativeHeight="251685888" behindDoc="1" locked="0" layoutInCell="1" allowOverlap="1">
             <wp:simplePos x="0" y="0"/>
             <wp:positionH relativeFrom="column">
-              <wp:posOffset>960755</wp:posOffset>
+              <wp:posOffset>1204595</wp:posOffset>
             </wp:positionH>
             <wp:positionV relativeFrom="paragraph">
-              <wp:posOffset>160020</wp:posOffset>
+              <wp:posOffset>89535</wp:posOffset>
             </wp:positionV>
-            <wp:extent cx="3352800" cy="2956560"/>
-            <wp:effectExtent l="0" t="0" r="0" b="0"/>
+            <wp:extent cx="2865120" cy="4716780"/>
+            <wp:effectExtent l="0" t="0" r="0" b="7620"/>
             <wp:wrapTight wrapText="bothSides">
               <wp:wrapPolygon>
                 <wp:start x="0" y="0"/>
-                <wp:lineTo x="0" y="21489"/>
-                <wp:lineTo x="21502" y="21489"/>
-                <wp:lineTo x="21502" y="0"/>
+                <wp:lineTo x="0" y="21565"/>
+                <wp:lineTo x="21485" y="21565"/>
+                <wp:lineTo x="21485" y="0"/>
                 <wp:lineTo x="0" y="0"/>
               </wp:wrapPolygon>
             </wp:wrapTight>
-            <wp:docPr id="32" name="Picture 5"/>
+            <wp:docPr id="4" name="Picture 1"/>
             <wp:cNvGraphicFramePr>
               <a:graphicFrameLocks xmlns:a="http://schemas.openxmlformats.org/drawingml/2006/main" noChangeAspect="1"/>
             </wp:cNvGraphicFramePr>
@@ -7968,7 +7636,7 @@
               <a:graphicData uri="http://schemas.openxmlformats.org/drawingml/2006/picture">
                 <pic:pic xmlns:pic="http://schemas.openxmlformats.org/drawingml/2006/picture">
                   <pic:nvPicPr>
-                    <pic:cNvPr id="32" name="Picture 5"/>
+                    <pic:cNvPr id="4" name="Picture 1"/>
                     <pic:cNvPicPr>
                       <a:picLocks noChangeAspect="1"/>
                     </pic:cNvPicPr>
@@ -7982,7 +7650,7 @@
                   <pic:spPr>
                     <a:xfrm>
                       <a:off x="0" y="0"/>
-                      <a:ext cx="3352800" cy="2956560"/>
+                      <a:ext cx="2865120" cy="4716780"/>
                     </a:xfrm>
                     <a:prstGeom prst="rect">
                       <a:avLst/>
@@ -7998,19 +7666,26 @@
           </wp:anchor>
         </w:drawing>
       </w:r>
-      <w:r>
-        <w:rPr>
-          <w:rFonts w:hint="default" w:ascii="Times New Roman" w:hAnsi="Times New Roman" w:eastAsia="SimSun" w:cs="Times New Roman"/>
-          <w:b/>
-          <w:bCs/>
-          <w:i/>
-          <w:iCs/>
-          <w:sz w:val="21"/>
-          <w:szCs w:val="21"/>
-          <w:lang w:val="en-US"/>
-        </w:rPr>
-        <w:br w:type="textWrapping"/>
-      </w:r>
+    </w:p>
+    <w:p>
+      <w:pPr>
+        <w:numPr>
+          <w:ilvl w:val="0"/>
+          <w:numId w:val="0"/>
+        </w:numPr>
+        <w:spacing w:line="240" w:lineRule="auto"/>
+        <w:ind w:leftChars="0"/>
+        <w:jc w:val="center"/>
+        <w:rPr>
+          <w:rFonts w:hint="default" w:ascii="Times New Roman" w:hAnsi="Times New Roman" w:eastAsia="SimSun" w:cs="Times New Roman"/>
+          <w:b/>
+          <w:bCs/>
+          <w:i/>
+          <w:iCs/>
+          <w:sz w:val="21"/>
+          <w:szCs w:val="21"/>
+        </w:rPr>
+      </w:pPr>
     </w:p>
     <w:p>
       <w:pPr>
@@ -8035,6 +7710,188 @@
           <w:lang w:val="en-US"/>
         </w:rPr>
       </w:pPr>
+      <w:r>
+        <w:rPr>
+          <w:rFonts w:hint="default" w:ascii="Times New Roman" w:hAnsi="Times New Roman" w:eastAsia="SimSun" w:cs="Times New Roman"/>
+          <w:b/>
+          <w:bCs/>
+          <w:i/>
+          <w:iCs/>
+          <w:sz w:val="21"/>
+          <w:szCs w:val="21"/>
+          <w:lang w:val="en-US"/>
+        </w:rPr>
+        <w:br w:type="textWrapping"/>
+      </w:r>
+      <w:r>
+        <w:rPr>
+          <w:rFonts w:hint="default" w:ascii="Times New Roman" w:hAnsi="Times New Roman" w:eastAsia="SimSun" w:cs="Times New Roman"/>
+          <w:b/>
+          <w:bCs/>
+          <w:i/>
+          <w:iCs/>
+          <w:sz w:val="21"/>
+          <w:szCs w:val="21"/>
+          <w:lang w:val="en-US"/>
+        </w:rPr>
+        <w:br w:type="textWrapping"/>
+      </w:r>
+      <w:r>
+        <w:rPr>
+          <w:rFonts w:hint="default" w:ascii="Times New Roman" w:hAnsi="Times New Roman" w:eastAsia="SimSun" w:cs="Times New Roman"/>
+          <w:b/>
+          <w:bCs/>
+          <w:i/>
+          <w:iCs/>
+          <w:sz w:val="21"/>
+          <w:szCs w:val="21"/>
+          <w:lang w:val="en-US"/>
+        </w:rPr>
+        <w:br w:type="textWrapping"/>
+      </w:r>
+      <w:r>
+        <w:rPr>
+          <w:rFonts w:hint="default" w:ascii="Times New Roman" w:hAnsi="Times New Roman" w:eastAsia="SimSun" w:cs="Times New Roman"/>
+          <w:b/>
+          <w:bCs/>
+          <w:i/>
+          <w:iCs/>
+          <w:sz w:val="21"/>
+          <w:szCs w:val="21"/>
+          <w:lang w:val="en-US"/>
+        </w:rPr>
+        <w:br w:type="textWrapping"/>
+      </w:r>
+      <w:r>
+        <w:rPr>
+          <w:rFonts w:hint="default" w:ascii="Times New Roman" w:hAnsi="Times New Roman" w:eastAsia="SimSun" w:cs="Times New Roman"/>
+          <w:b/>
+          <w:bCs/>
+          <w:i/>
+          <w:iCs/>
+          <w:sz w:val="21"/>
+          <w:szCs w:val="21"/>
+          <w:lang w:val="en-US"/>
+        </w:rPr>
+        <w:br w:type="textWrapping"/>
+      </w:r>
+      <w:r>
+        <w:rPr>
+          <w:rFonts w:hint="default" w:ascii="Times New Roman" w:hAnsi="Times New Roman" w:eastAsia="SimSun" w:cs="Times New Roman"/>
+          <w:b/>
+          <w:bCs/>
+          <w:i/>
+          <w:iCs/>
+          <w:sz w:val="21"/>
+          <w:szCs w:val="21"/>
+          <w:lang w:val="en-US"/>
+        </w:rPr>
+        <w:br w:type="textWrapping"/>
+      </w:r>
+      <w:r>
+        <w:rPr>
+          <w:rFonts w:hint="default" w:ascii="Times New Roman" w:hAnsi="Times New Roman" w:eastAsia="SimSun" w:cs="Times New Roman"/>
+          <w:b/>
+          <w:bCs/>
+          <w:i/>
+          <w:iCs/>
+          <w:sz w:val="21"/>
+          <w:szCs w:val="21"/>
+          <w:lang w:val="en-US"/>
+        </w:rPr>
+        <w:br w:type="textWrapping"/>
+      </w:r>
+      <w:r>
+        <w:rPr>
+          <w:rFonts w:hint="default" w:ascii="Times New Roman" w:hAnsi="Times New Roman" w:eastAsia="SimSun" w:cs="Times New Roman"/>
+          <w:b/>
+          <w:bCs/>
+          <w:i/>
+          <w:iCs/>
+          <w:sz w:val="21"/>
+          <w:szCs w:val="21"/>
+          <w:lang w:val="en-US"/>
+        </w:rPr>
+        <w:br w:type="textWrapping"/>
+      </w:r>
+      <w:r>
+        <w:rPr>
+          <w:rFonts w:hint="default" w:ascii="Times New Roman" w:hAnsi="Times New Roman" w:eastAsia="SimSun" w:cs="Times New Roman"/>
+          <w:b/>
+          <w:bCs/>
+          <w:i/>
+          <w:iCs/>
+          <w:sz w:val="21"/>
+          <w:szCs w:val="21"/>
+          <w:lang w:val="en-US"/>
+        </w:rPr>
+        <w:br w:type="textWrapping"/>
+      </w:r>
+      <w:r>
+        <w:rPr>
+          <w:rFonts w:hint="default" w:ascii="Times New Roman" w:hAnsi="Times New Roman" w:eastAsia="SimSun" w:cs="Times New Roman"/>
+          <w:b/>
+          <w:bCs/>
+          <w:i/>
+          <w:iCs/>
+          <w:sz w:val="21"/>
+          <w:szCs w:val="21"/>
+          <w:lang w:val="en-US"/>
+        </w:rPr>
+        <w:br w:type="textWrapping"/>
+      </w:r>
+      <w:r>
+        <w:rPr>
+          <w:rFonts w:hint="default" w:ascii="Times New Roman" w:hAnsi="Times New Roman" w:eastAsia="SimSun" w:cs="Times New Roman"/>
+          <w:b/>
+          <w:bCs/>
+          <w:i/>
+          <w:iCs/>
+          <w:sz w:val="21"/>
+          <w:szCs w:val="21"/>
+          <w:lang w:val="en-US"/>
+        </w:rPr>
+        <w:br w:type="textWrapping"/>
+      </w:r>
+      <w:r>
+        <w:rPr>
+          <w:rFonts w:hint="default" w:ascii="Times New Roman" w:hAnsi="Times New Roman" w:eastAsia="SimSun" w:cs="Times New Roman"/>
+          <w:b/>
+          <w:bCs/>
+          <w:i/>
+          <w:iCs/>
+          <w:sz w:val="21"/>
+          <w:szCs w:val="21"/>
+          <w:lang w:val="en-US"/>
+        </w:rPr>
+        <w:br w:type="textWrapping"/>
+      </w:r>
+      <w:r>
+        <w:rPr>
+          <w:rFonts w:hint="default" w:ascii="Times New Roman" w:hAnsi="Times New Roman" w:eastAsia="SimSun" w:cs="Times New Roman"/>
+          <w:b/>
+          <w:bCs/>
+          <w:i/>
+          <w:iCs/>
+          <w:sz w:val="21"/>
+          <w:szCs w:val="21"/>
+          <w:lang w:val="en-US"/>
+        </w:rPr>
+        <w:br w:type="textWrapping"/>
+      </w:r>
+      <w:r>
+        <w:rPr>
+          <w:rFonts w:hint="default" w:ascii="Times New Roman" w:hAnsi="Times New Roman" w:eastAsia="SimSun" w:cs="Times New Roman"/>
+          <w:b/>
+          <w:bCs/>
+          <w:i/>
+          <w:iCs/>
+          <w:sz w:val="21"/>
+          <w:szCs w:val="21"/>
+          <w:lang w:val="en-US"/>
+        </w:rPr>
+        <w:br w:type="textWrapping"/>
+      </w:r>
     </w:p>
     <w:p>
       <w:pPr>
@@ -8107,102 +7964,19 @@
           <w:lang w:val="en-US"/>
         </w:rPr>
       </w:pPr>
-    </w:p>
-    <w:p>
-      <w:pPr>
-        <w:numPr>
-          <w:ilvl w:val="0"/>
-          <w:numId w:val="0"/>
-        </w:numPr>
-        <w:pBdr>
-          <w:bottom w:val="single" w:color="auto" w:sz="4" w:space="0"/>
-        </w:pBdr>
-        <w:spacing w:line="240" w:lineRule="auto"/>
-        <w:ind w:leftChars="0"/>
-        <w:jc w:val="center"/>
-        <w:rPr>
-          <w:rFonts w:hint="default" w:ascii="Times New Roman" w:hAnsi="Times New Roman" w:eastAsia="SimSun" w:cs="Times New Roman"/>
-          <w:b/>
-          <w:bCs/>
-          <w:i/>
-          <w:iCs/>
-          <w:sz w:val="21"/>
-          <w:szCs w:val="21"/>
-          <w:lang w:val="en-US"/>
-        </w:rPr>
-      </w:pPr>
-    </w:p>
-    <w:p>
-      <w:pPr>
-        <w:numPr>
-          <w:ilvl w:val="0"/>
-          <w:numId w:val="0"/>
-        </w:numPr>
-        <w:pBdr>
-          <w:bottom w:val="single" w:color="auto" w:sz="4" w:space="0"/>
-        </w:pBdr>
-        <w:spacing w:line="240" w:lineRule="auto"/>
-        <w:ind w:leftChars="0"/>
-        <w:jc w:val="center"/>
-        <w:rPr>
-          <w:rFonts w:hint="default" w:ascii="Times New Roman" w:hAnsi="Times New Roman" w:eastAsia="SimSun" w:cs="Times New Roman"/>
-          <w:b/>
-          <w:bCs/>
-          <w:i/>
-          <w:iCs/>
-          <w:sz w:val="21"/>
-          <w:szCs w:val="21"/>
-          <w:lang w:val="en-US"/>
-        </w:rPr>
-      </w:pPr>
-    </w:p>
-    <w:p>
-      <w:pPr>
-        <w:numPr>
-          <w:ilvl w:val="0"/>
-          <w:numId w:val="0"/>
-        </w:numPr>
-        <w:pBdr>
-          <w:bottom w:val="single" w:color="auto" w:sz="4" w:space="0"/>
-        </w:pBdr>
-        <w:spacing w:line="240" w:lineRule="auto"/>
-        <w:ind w:leftChars="0"/>
-        <w:jc w:val="center"/>
-        <w:rPr>
-          <w:rFonts w:hint="default" w:ascii="Times New Roman" w:hAnsi="Times New Roman" w:eastAsia="SimSun" w:cs="Times New Roman"/>
-          <w:b/>
-          <w:bCs/>
-          <w:i/>
-          <w:iCs/>
-          <w:sz w:val="21"/>
-          <w:szCs w:val="21"/>
-          <w:lang w:val="en-US"/>
-        </w:rPr>
-      </w:pPr>
-    </w:p>
-    <w:p>
-      <w:pPr>
-        <w:numPr>
-          <w:ilvl w:val="0"/>
-          <w:numId w:val="0"/>
-        </w:numPr>
-        <w:pBdr>
-          <w:bottom w:val="single" w:color="auto" w:sz="4" w:space="0"/>
-        </w:pBdr>
-        <w:spacing w:line="240" w:lineRule="auto"/>
-        <w:ind w:leftChars="0"/>
-        <w:jc w:val="center"/>
-        <w:rPr>
-          <w:rFonts w:hint="default" w:ascii="Times New Roman" w:hAnsi="Times New Roman" w:eastAsia="SimSun" w:cs="Times New Roman"/>
-          <w:b/>
-          <w:bCs/>
-          <w:i/>
-          <w:iCs/>
-          <w:sz w:val="21"/>
-          <w:szCs w:val="21"/>
-          <w:lang w:val="en-US"/>
-        </w:rPr>
-      </w:pPr>
+      <w:r>
+        <w:rPr>
+          <w:rFonts w:hint="default" w:ascii="Times New Roman" w:hAnsi="Times New Roman" w:eastAsia="SimSun" w:cs="Times New Roman"/>
+          <w:b/>
+          <w:bCs/>
+          <w:i/>
+          <w:iCs/>
+          <w:sz w:val="21"/>
+          <w:szCs w:val="21"/>
+          <w:lang w:val="en-US"/>
+        </w:rPr>
+        <w:br w:type="textWrapping"/>
+      </w:r>
     </w:p>
     <w:p>
       <w:pPr>
@@ -9697,90 +9471,16 @@
           <w:szCs w:val="21"/>
         </w:rPr>
       </w:pPr>
-    </w:p>
-    <w:p>
-      <w:pPr>
-        <w:ind w:left="0" w:leftChars="0" w:firstLine="0" w:firstLineChars="0"/>
-        <w:jc w:val="both"/>
-        <w:rPr>
-          <w:rFonts w:hint="default" w:ascii="Times New Roman" w:hAnsi="Times New Roman" w:eastAsia="SimSun" w:cs="Times New Roman"/>
-          <w:b/>
-          <w:bCs/>
-          <w:i/>
-          <w:iCs/>
-          <w:sz w:val="21"/>
-          <w:szCs w:val="21"/>
-        </w:rPr>
-      </w:pPr>
-    </w:p>
-    <w:p>
-      <w:pPr>
-        <w:ind w:left="0" w:leftChars="0" w:firstLine="0" w:firstLineChars="0"/>
-        <w:jc w:val="both"/>
-        <w:rPr>
-          <w:rFonts w:hint="default" w:ascii="Times New Roman" w:hAnsi="Times New Roman" w:eastAsia="SimSun" w:cs="Times New Roman"/>
-          <w:b/>
-          <w:bCs/>
-          <w:i/>
-          <w:iCs/>
-          <w:sz w:val="21"/>
-          <w:szCs w:val="21"/>
-        </w:rPr>
-      </w:pPr>
-    </w:p>
-    <w:p>
-      <w:pPr>
-        <w:ind w:left="0" w:leftChars="0" w:firstLine="0" w:firstLineChars="0"/>
-        <w:jc w:val="both"/>
-        <w:rPr>
-          <w:rFonts w:hint="default" w:ascii="Times New Roman" w:hAnsi="Times New Roman" w:eastAsia="SimSun" w:cs="Times New Roman"/>
-          <w:b/>
-          <w:bCs/>
-          <w:i/>
-          <w:iCs/>
-          <w:sz w:val="21"/>
-          <w:szCs w:val="21"/>
-        </w:rPr>
-      </w:pPr>
-    </w:p>
-    <w:p>
-      <w:pPr>
-        <w:ind w:left="0" w:leftChars="0" w:firstLine="0" w:firstLineChars="0"/>
-        <w:jc w:val="both"/>
-        <w:rPr>
-          <w:rFonts w:hint="default" w:ascii="Times New Roman" w:hAnsi="Times New Roman" w:eastAsia="SimSun" w:cs="Times New Roman"/>
-          <w:b/>
-          <w:bCs/>
-          <w:i/>
-          <w:iCs/>
-          <w:sz w:val="21"/>
-          <w:szCs w:val="21"/>
-        </w:rPr>
-      </w:pPr>
-    </w:p>
-    <w:p>
-      <w:pPr>
-        <w:ind w:left="0" w:leftChars="0" w:firstLine="0" w:firstLineChars="0"/>
-        <w:jc w:val="both"/>
-        <w:rPr>
-          <w:rFonts w:hint="default" w:ascii="Times New Roman" w:hAnsi="Times New Roman" w:eastAsia="SimSun" w:cs="Times New Roman"/>
-          <w:b w:val="0"/>
-          <w:bCs w:val="0"/>
-          <w:i/>
-          <w:iCs/>
-          <w:sz w:val="21"/>
-          <w:szCs w:val="21"/>
-        </w:rPr>
-      </w:pPr>
+      <w:bookmarkStart w:id="0" w:name="_GoBack"/>
       <w:r>
         <w:drawing>
-          <wp:anchor distT="0" distB="0" distL="114300" distR="114300" simplePos="0" relativeHeight="251685888" behindDoc="0" locked="0" layoutInCell="1" allowOverlap="1">
+          <wp:anchor distT="0" distB="0" distL="114300" distR="114300" simplePos="0" relativeHeight="251684864" behindDoc="0" locked="0" layoutInCell="1" allowOverlap="1">
             <wp:simplePos x="0" y="0"/>
             <wp:positionH relativeFrom="column">
               <wp:posOffset>2540</wp:posOffset>
             </wp:positionH>
             <wp:positionV relativeFrom="paragraph">
-              <wp:posOffset>0</wp:posOffset>
+              <wp:posOffset>350520</wp:posOffset>
             </wp:positionV>
             <wp:extent cx="5269230" cy="1280795"/>
             <wp:effectExtent l="0" t="0" r="3810" b="14605"/>
@@ -9823,6 +9523,22 @@
           </wp:anchor>
         </w:drawing>
       </w:r>
+      <w:bookmarkEnd w:id="0"/>
+    </w:p>
+    <w:p>
+      <w:pPr>
+        <w:ind w:left="0" w:leftChars="0" w:firstLine="0" w:firstLineChars="0"/>
+        <w:jc w:val="both"/>
+        <w:rPr>
+          <w:rFonts w:hint="default" w:ascii="Times New Roman" w:hAnsi="Times New Roman" w:eastAsia="SimSun" w:cs="Times New Roman"/>
+          <w:b w:val="0"/>
+          <w:bCs w:val="0"/>
+          <w:i/>
+          <w:iCs/>
+          <w:sz w:val="21"/>
+          <w:szCs w:val="21"/>
+        </w:rPr>
+      </w:pPr>
     </w:p>
     <w:p>
       <w:pPr>

</xml_diff>